<commit_message>
docs: update notebooks, outputs, and master solved pdf
</commit_message>
<xml_diff>
--- a/DM2026-Lab1-Master-Questions.docx
+++ b/DM2026-Lab1-Master-Questions.docx
@@ -1,6 +1,6 @@
 
 <file path=word/document.xml><?xml version="1.0" encoding="utf-8"?>
-<w:document xmlns:wpc="http://schemas.microsoft.com/office/word/2010/wordprocessingCanvas" xmlns:cx="http://schemas.microsoft.com/office/drawing/2014/chartex" xmlns:cx1="http://schemas.microsoft.com/office/drawing/2015/9/8/chartex" xmlns:cx2="http://schemas.microsoft.com/office/drawing/2015/10/21/chartex" xmlns:cx3="http://schemas.microsoft.com/office/drawing/2016/5/9/chartex" xmlns:cx4="http://schemas.microsoft.com/office/drawing/2016/5/10/chartex" xmlns:cx5="http://schemas.microsoft.com/office/drawing/2016/5/11/chartex" xmlns:cx6="http://schemas.microsoft.com/office/drawing/2016/5/12/chartex" xmlns:cx7="http://schemas.microsoft.com/office/drawing/2016/5/13/chartex" xmlns:cx8="http://schemas.microsoft.com/office/drawing/2016/5/14/chartex" xmlns:mc="http://schemas.openxmlformats.org/markup-compatibility/2006" xmlns:aink="http://schemas.microsoft.com/office/drawing/2016/ink" xmlns:am3d="http://schemas.microsoft.com/office/drawing/2017/model3d" xmlns:o="urn:schemas-microsoft-com:office:office" xmlns:oel="http://schemas.microsoft.com/office/2019/extlst" xmlns:r="http://schemas.openxmlformats.org/officeDocument/2006/relationships" xmlns:m="http://schemas.openxmlformats.org/officeDocument/2006/math" xmlns:v="urn:schemas-microsoft-com:vml" xmlns:wp14="http://schemas.microsoft.com/office/word/2010/wordprocessingDrawing" xmlns:wp="http://schemas.openxmlformats.org/drawingml/2006/wordprocessingDrawing" xmlns:w10="urn:schemas-microsoft-com:office:word" xmlns:w="http://schemas.openxmlformats.org/wordprocessingml/2006/main" xmlns:w14="http://schemas.microsoft.com/office/word/2010/wordml" xmlns:w15="http://schemas.microsoft.com/office/word/2012/wordml" xmlns:w16cex="http://schemas.microsoft.com/office/word/2018/wordml/cex" xmlns:w16cid="http://schemas.microsoft.com/office/word/2016/wordml/cid" xmlns:w16="http://schemas.microsoft.com/office/word/2018/wordml" xmlns:w16du="http://schemas.microsoft.com/office/word/2023/wordml/word16du" xmlns:w16sdtdh="http://schemas.microsoft.com/office/word/2020/wordml/sdtdatahash" xmlns:w16sdtfl="http://schemas.microsoft.com/office/word/2024/wordml/sdtformatlock" xmlns:w16se="http://schemas.microsoft.com/office/word/2015/wordml/symex" xmlns:wpg="http://schemas.microsoft.com/office/word/2010/wordprocessingGroup" xmlns:wpi="http://schemas.microsoft.com/office/word/2010/wordprocessingInk" xmlns:wne="http://schemas.microsoft.com/office/word/2006/wordml" xmlns:wps="http://schemas.microsoft.com/office/word/2010/wordprocessingShape" mc:Ignorable="w14 w15 w16se w16cid w16 w16cex w16sdtdh w16sdtfl w16du wp14">
+<w:document xmlns:wpc="http://schemas.microsoft.com/office/word/2010/wordprocessingCanvas" xmlns:cx="http://schemas.microsoft.com/office/drawing/2014/chartex" xmlns:cx1="http://schemas.microsoft.com/office/drawing/2015/9/8/chartex" xmlns:cx2="http://schemas.microsoft.com/office/drawing/2015/10/21/chartex" xmlns:cx3="http://schemas.microsoft.com/office/drawing/2016/5/9/chartex" xmlns:cx4="http://schemas.microsoft.com/office/drawing/2016/5/10/chartex" xmlns:cx5="http://schemas.microsoft.com/office/drawing/2016/5/11/chartex" xmlns:cx6="http://schemas.microsoft.com/office/drawing/2016/5/12/chartex" xmlns:cx7="http://schemas.microsoft.com/office/drawing/2016/5/13/chartex" xmlns:cx8="http://schemas.microsoft.com/office/drawing/2016/5/14/chartex" xmlns:mc="http://schemas.openxmlformats.org/markup-compatibility/2006" xmlns:m="http://schemas.openxmlformats.org/officeDocument/2006/math" xmlns:aink="http://schemas.microsoft.com/office/drawing/2016/ink" xmlns:am3d="http://schemas.microsoft.com/office/drawing/2017/model3d" xmlns:oel="http://schemas.microsoft.com/office/2019/extlst" xmlns:r="http://schemas.openxmlformats.org/officeDocument/2006/relationships" xmlns:wp14="http://schemas.microsoft.com/office/word/2010/wordprocessingDrawing" xmlns:wp="http://schemas.openxmlformats.org/drawingml/2006/wordprocessingDrawing" xmlns:wpg="http://schemas.microsoft.com/office/word/2010/wordprocessingGroup" xmlns:wpi="http://schemas.microsoft.com/office/word/2010/wordprocessingInk" xmlns:wps="http://schemas.microsoft.com/office/word/2010/wordprocessingShape" xmlns:o="urn:schemas-microsoft-com:office:office" xmlns:v="urn:schemas-microsoft-com:vml" xmlns:w10="urn:schemas-microsoft-com:office:word" xmlns:w="http://schemas.openxmlformats.org/wordprocessingml/2006/main" xmlns:w14="http://schemas.microsoft.com/office/word/2010/wordml" xmlns:w15="http://schemas.microsoft.com/office/word/2012/wordml" xmlns:w16cex="http://schemas.microsoft.com/office/word/2018/wordml/cex" xmlns:w16cid="http://schemas.microsoft.com/office/word/2016/wordml/cid" xmlns:w16="http://schemas.microsoft.com/office/word/2018/wordml" xmlns:w16sdtdh="http://schemas.microsoft.com/office/word/2020/wordml/sdtdatahash" xmlns:w16sdtfl="http://schemas.microsoft.com/office/word/2024/wordml/sdtformatlock" xmlns:w16se="http://schemas.microsoft.com/office/word/2015/wordml/symex" xmlns:w16du="http://schemas.microsoft.com/office/word/2023/wordml/word16du" xmlns:wne="http://schemas.microsoft.com/office/word/2006/wordml" mc:Ignorable="w14 w15 w16se w16cid w16 w16cex w16sdtdh w16sdtfl w16du wp14">
   <w:body>
     <w:p>
       <w:pPr>
@@ -95,10 +95,15 @@
       </w:pPr>
       <w:r>
         <w:rPr>
-          <w:rFonts w:ascii="Century Schoolbook" w:hAnsi="Century Schoolbook"/>
-        </w:rPr>
-        <w:pict w14:anchorId="12157EBA">
-          <v:rect id="_x0000_i1025" style="width:0;height:1.5pt" o:hralign="center" o:hrstd="t" o:hr="t" fillcolor="#a0a0a0" stroked="f"/>
+          <w:noProof/>
+        </w:rPr>
+      </w:r>
+      <w:r>
+        <w:pict w14:anchorId="06FBA7DD">
+          <v:rect id="Horizontal Line 1" o:spid="_x0000_s2062" style="width:451.3pt;height:1.1pt;visibility:visible;mso-wrap-style:square;mso-left-percent:-10001;mso-top-percent:-10001;mso-position-horizontal:absolute;mso-position-horizontal-relative:char;mso-position-vertical:absolute;mso-position-vertical-relative:line;mso-left-percent:-10001;mso-top-percent:-10001;v-text-anchor:top" o:gfxdata="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" filled="f">
+            <o:lock v:ext="edit" rotation="t" aspectratio="t" verticies="t" text="t" shapetype="t"/>
+            <w10:anchorlock/>
+          </v:rect>
         </w:pict>
       </w:r>
     </w:p>
@@ -184,7 +189,7 @@
         </w:numPr>
         <w:jc w:val="both"/>
         <w:rPr>
-          <w:rFonts w:ascii="Century Schoolbook" w:hAnsi="Century Schoolbook"/>
+          <w:rFonts w:ascii="Century Schoolbook" w:hAnsi="Century Schoolbook" w:hint="eastAsia"/>
         </w:rPr>
       </w:pPr>
       <w:r>
@@ -194,6 +199,30 @@
           <w:bCs/>
         </w:rPr>
         <w:t>English Name:</w:t>
+      </w:r>
+      <w:r>
+        <w:rPr>
+          <w:rFonts w:ascii="Century Schoolbook" w:hAnsi="Century Schoolbook"/>
+          <w:b/>
+          <w:bCs/>
+        </w:rPr>
+        <w:t xml:space="preserve"> Grace</w:t>
+      </w:r>
+      <w:r>
+        <w:rPr>
+          <w:rFonts w:ascii="Century Schoolbook" w:hAnsi="Century Schoolbook" w:hint="eastAsia"/>
+          <w:b/>
+          <w:bCs/>
+        </w:rPr>
+        <w:t xml:space="preserve"> </w:t>
+      </w:r>
+      <w:r>
+        <w:rPr>
+          <w:rFonts w:ascii="Century Schoolbook" w:hAnsi="Century Schoolbook"/>
+          <w:b/>
+          <w:bCs/>
+        </w:rPr>
+        <w:t>(HSU Chia-Hsin)</w:t>
       </w:r>
     </w:p>
     <w:p>
@@ -215,6 +244,22 @@
         </w:rPr>
         <w:t>Chinese Name:</w:t>
       </w:r>
+      <w:r>
+        <w:rPr>
+          <w:rFonts w:ascii="Century Schoolbook" w:hAnsi="Century Schoolbook"/>
+          <w:b/>
+          <w:bCs/>
+        </w:rPr>
+        <w:t xml:space="preserve"> </w:t>
+      </w:r>
+      <w:r>
+        <w:rPr>
+          <w:rFonts w:ascii="Century Schoolbook" w:hAnsi="Century Schoolbook" w:hint="eastAsia"/>
+          <w:b/>
+          <w:bCs/>
+        </w:rPr>
+        <w:t>許家炘</w:t>
+      </w:r>
     </w:p>
     <w:p>
       <w:pPr>
@@ -235,6 +280,14 @@
         </w:rPr>
         <w:t>Email:</w:t>
       </w:r>
+      <w:r>
+        <w:rPr>
+          <w:rFonts w:ascii="Century Schoolbook" w:hAnsi="Century Schoolbook"/>
+          <w:b/>
+          <w:bCs/>
+        </w:rPr>
+        <w:t xml:space="preserve"> gracee1109@gapp.nthu.edu.tw</w:t>
+      </w:r>
     </w:p>
     <w:p>
       <w:pPr>
@@ -255,6 +308,14 @@
         </w:rPr>
         <w:t>Student ID:</w:t>
       </w:r>
+      <w:r>
+        <w:rPr>
+          <w:rFonts w:ascii="Century Schoolbook" w:hAnsi="Century Schoolbook"/>
+          <w:b/>
+          <w:bCs/>
+        </w:rPr>
+        <w:t xml:space="preserve"> 111096033</w:t>
+      </w:r>
     </w:p>
     <w:p>
       <w:pPr>
@@ -275,20 +336,33 @@
         </w:rPr>
         <w:t>University:</w:t>
       </w:r>
-    </w:p>
-    <w:p>
-      <w:pPr>
-        <w:jc w:val="both"/>
-        <w:rPr>
-          <w:rFonts w:ascii="Century Schoolbook" w:hAnsi="Century Schoolbook"/>
-        </w:rPr>
-      </w:pPr>
-      <w:r>
-        <w:rPr>
-          <w:rFonts w:ascii="Century Schoolbook" w:hAnsi="Century Schoolbook"/>
-        </w:rPr>
-        <w:pict w14:anchorId="5DAB6F00">
-          <v:rect id="_x0000_i1026" style="width:0;height:1.5pt" o:hralign="center" o:hrstd="t" o:hr="t" fillcolor="#a0a0a0" stroked="f"/>
+      <w:r>
+        <w:rPr>
+          <w:rFonts w:ascii="Century Schoolbook" w:hAnsi="Century Schoolbook"/>
+          <w:b/>
+          <w:bCs/>
+        </w:rPr>
+        <w:t xml:space="preserve"> National Tsing Hua University</w:t>
+      </w:r>
+    </w:p>
+    <w:p>
+      <w:pPr>
+        <w:jc w:val="both"/>
+        <w:rPr>
+          <w:rFonts w:ascii="Century Schoolbook" w:hAnsi="Century Schoolbook"/>
+        </w:rPr>
+      </w:pPr>
+      <w:r>
+        <w:rPr>
+          <w:noProof/>
+        </w:rPr>
+      </w:r>
+      <w:r>
+        <w:pict w14:anchorId="464F6944">
+          <v:rect id="Horizontal Line 2" o:spid="_x0000_s2061" style="width:451.3pt;height:1.1pt;visibility:visible;mso-wrap-style:square;mso-left-percent:-10001;mso-top-percent:-10001;mso-position-horizontal:absolute;mso-position-horizontal-relative:char;mso-position-vertical:absolute;mso-position-vertical-relative:line;mso-left-percent:-10001;mso-top-percent:-10001;v-text-anchor:top" o:gfxdata="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" filled="f">
+            <o:lock v:ext="edit" rotation="t" aspectratio="t" verticies="t" text="t" shapetype="t"/>
+            <w10:anchorlock/>
+          </v:rect>
         </w:pict>
       </w:r>
     </w:p>
@@ -449,35 +523,7 @@
         <w:rPr>
           <w:rFonts w:ascii="Century Schoolbook" w:hAnsi="Century Schoolbook"/>
         </w:rPr>
-        <w:t xml:space="preserve">Read the task; change parameters when asked (e.g. </w:t>
-      </w:r>
-      <w:proofErr w:type="spellStart"/>
-      <w:r>
-        <w:rPr>
-          <w:rFonts w:ascii="Century Schoolbook" w:hAnsi="Century Schoolbook"/>
-        </w:rPr>
-        <w:t>stop_words</w:t>
-      </w:r>
-      <w:proofErr w:type="spellEnd"/>
-      <w:r>
-        <w:rPr>
-          <w:rFonts w:ascii="Century Schoolbook" w:hAnsi="Century Schoolbook"/>
-        </w:rPr>
-        <w:t xml:space="preserve">, thresholds, k, </w:t>
-      </w:r>
-      <w:proofErr w:type="spellStart"/>
-      <w:r>
-        <w:rPr>
-          <w:rFonts w:ascii="Century Schoolbook" w:hAnsi="Century Schoolbook"/>
-        </w:rPr>
-        <w:t>minSup</w:t>
-      </w:r>
-      <w:proofErr w:type="spellEnd"/>
-      <w:r>
-        <w:rPr>
-          <w:rFonts w:ascii="Century Schoolbook" w:hAnsi="Century Schoolbook"/>
-        </w:rPr>
-        <w:t>).</w:t>
+        <w:t>Read the task; change parameters when asked (e.g. stop_words, thresholds, k, minSup).</w:t>
       </w:r>
     </w:p>
     <w:p>
@@ -937,7 +983,7 @@
     </w:p>
     <w:p>
       <w:pPr>
-        <w:pStyle w:val="ListParagraph"/>
+        <w:pStyle w:val="a9"/>
         <w:numPr>
           <w:ilvl w:val="0"/>
           <w:numId w:val="15"/>
@@ -978,16 +1024,16 @@
     </w:p>
     <w:p>
       <w:pPr>
-        <w:pStyle w:val="ListParagraph"/>
-        <w:jc w:val="both"/>
-        <w:rPr>
-          <w:rFonts w:ascii="Century Schoolbook" w:hAnsi="Century Schoolbook"/>
-        </w:rPr>
-      </w:pPr>
-    </w:p>
-    <w:p>
-      <w:pPr>
-        <w:pStyle w:val="ListParagraph"/>
+        <w:pStyle w:val="a9"/>
+        <w:jc w:val="both"/>
+        <w:rPr>
+          <w:rFonts w:ascii="Century Schoolbook" w:hAnsi="Century Schoolbook"/>
+        </w:rPr>
+      </w:pPr>
+    </w:p>
+    <w:p>
+      <w:pPr>
+        <w:pStyle w:val="a9"/>
         <w:numPr>
           <w:ilvl w:val="0"/>
           <w:numId w:val="15"/>
@@ -1042,16 +1088,16 @@
     </w:p>
     <w:p>
       <w:pPr>
-        <w:pStyle w:val="ListParagraph"/>
-        <w:jc w:val="both"/>
-        <w:rPr>
-          <w:rFonts w:ascii="Century Schoolbook" w:hAnsi="Century Schoolbook"/>
-        </w:rPr>
-      </w:pPr>
-    </w:p>
-    <w:p>
-      <w:pPr>
-        <w:pStyle w:val="ListParagraph"/>
+        <w:pStyle w:val="a9"/>
+        <w:jc w:val="both"/>
+        <w:rPr>
+          <w:rFonts w:ascii="Century Schoolbook" w:hAnsi="Century Schoolbook"/>
+        </w:rPr>
+      </w:pPr>
+    </w:p>
+    <w:p>
+      <w:pPr>
+        <w:pStyle w:val="a9"/>
         <w:numPr>
           <w:ilvl w:val="0"/>
           <w:numId w:val="15"/>
@@ -1087,21 +1133,7 @@
         <w:rPr>
           <w:rFonts w:ascii="Century Schoolbook" w:hAnsi="Century Schoolbook"/>
         </w:rPr>
-        <w:t xml:space="preserve"> or leave it blank only if you truly did not use AI for that question. References are still encouraged if you </w:t>
-      </w:r>
-      <w:proofErr w:type="gramStart"/>
-      <w:r>
-        <w:rPr>
-          <w:rFonts w:ascii="Century Schoolbook" w:hAnsi="Century Schoolbook"/>
-        </w:rPr>
-        <w:t>looked</w:t>
-      </w:r>
-      <w:proofErr w:type="gramEnd"/>
-      <w:r>
-        <w:rPr>
-          <w:rFonts w:ascii="Century Schoolbook" w:hAnsi="Century Schoolbook"/>
-        </w:rPr>
-        <w:t xml:space="preserve"> anything up.</w:t>
+        <w:t xml:space="preserve"> or leave it blank only if you truly did not use AI for that question. References are still encouraged if you looked anything up.</w:t>
       </w:r>
     </w:p>
     <w:p>
@@ -1291,11 +1323,15 @@
       </w:pPr>
       <w:r>
         <w:rPr>
-          <w:rFonts w:ascii="Century Schoolbook" w:hAnsi="Century Schoolbook"/>
-        </w:rPr>
-        <w:lastRenderedPageBreak/>
-        <w:pict w14:anchorId="14CE2D24">
-          <v:rect id="_x0000_i1027" style="width:0;height:1.5pt" o:hralign="center" o:hrstd="t" o:hr="t" fillcolor="#a0a0a0" stroked="f"/>
+          <w:noProof/>
+        </w:rPr>
+      </w:r>
+      <w:r>
+        <w:pict w14:anchorId="00FBD281">
+          <v:rect id="Horizontal Line 3" o:spid="_x0000_s2060" style="width:451.3pt;height:1.1pt;visibility:visible;mso-wrap-style:square;mso-left-percent:-10001;mso-top-percent:-10001;mso-position-horizontal:absolute;mso-position-horizontal-relative:char;mso-position-vertical:absolute;mso-position-vertical-relative:line;mso-left-percent:-10001;mso-top-percent:-10001;v-text-anchor:top" o:gfxdata="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" filled="f">
+            <o:lock v:ext="edit" rotation="t" aspectratio="t" verticies="t" text="t" shapetype="t"/>
+            <w10:anchorlock/>
+          </v:rect>
         </w:pict>
       </w:r>
     </w:p>
@@ -1380,21 +1416,7 @@
         <w:rPr>
           <w:rFonts w:ascii="Century Schoolbook" w:hAnsi="Century Schoolbook"/>
         </w:rPr>
-        <w:t xml:space="preserve"> Filter the </w:t>
-      </w:r>
-      <w:proofErr w:type="spellStart"/>
-      <w:r>
-        <w:rPr>
-          <w:rFonts w:ascii="Century Schoolbook" w:hAnsi="Century Schoolbook"/>
-        </w:rPr>
-        <w:t>dataframe</w:t>
-      </w:r>
-      <w:proofErr w:type="spellEnd"/>
-      <w:r>
-        <w:rPr>
-          <w:rFonts w:ascii="Century Schoolbook" w:hAnsi="Century Schoolbook"/>
-        </w:rPr>
-        <w:t xml:space="preserve"> </w:t>
+        <w:t xml:space="preserve"> Filter the dataframe </w:t>
       </w:r>
       <w:r>
         <w:rPr>
@@ -1410,7 +1432,6 @@
         </w:rPr>
         <w:t xml:space="preserve"> for the category </w:t>
       </w:r>
-      <w:proofErr w:type="spellStart"/>
       <w:r>
         <w:rPr>
           <w:rFonts w:ascii="Century Schoolbook" w:hAnsi="Century Schoolbook"/>
@@ -1419,7 +1440,6 @@
         </w:rPr>
         <w:t>sci.med</w:t>
       </w:r>
-      <w:proofErr w:type="spellEnd"/>
       <w:r>
         <w:rPr>
           <w:rFonts w:ascii="Century Schoolbook" w:hAnsi="Century Schoolbook"/>
@@ -1492,6 +1512,8 @@
         <w:jc w:val="both"/>
         <w:rPr>
           <w:rFonts w:ascii="Century Schoolbook" w:hAnsi="Century Schoolbook"/>
+          <w:b/>
+          <w:bCs/>
         </w:rPr>
       </w:pPr>
       <w:r>
@@ -1513,6 +1535,32 @@
       <w:r>
         <w:rPr>
           <w:rFonts w:ascii="Century Schoolbook" w:hAnsi="Century Schoolbook"/>
+        </w:rPr>
+        <w:t xml:space="preserve">There are 594 documents in the sci.med category. Isolating specific categories is critical because mixing disparate </w:t>
+      </w:r>
+      <w:r>
+        <w:rPr>
+          <w:rFonts w:ascii="Century Schoolbook" w:hAnsi="Century Schoolbook"/>
+        </w:rPr>
+        <w:t>categories</w:t>
+      </w:r>
+      <w:r>
+        <w:rPr>
+          <w:rFonts w:ascii="Century Schoolbook" w:hAnsi="Century Schoolbook"/>
+        </w:rPr>
+        <w:t xml:space="preserve"> introduces cross-domain noise and causes pattern mining to discover trivial rather than domain-specific associations. </w:t>
+      </w:r>
+    </w:p>
+    <w:p>
+      <w:pPr>
+        <w:jc w:val="both"/>
+        <w:rPr>
+          <w:rFonts w:ascii="Century Schoolbook" w:hAnsi="Century Schoolbook"/>
+        </w:rPr>
+      </w:pPr>
+      <w:r>
+        <w:rPr>
+          <w:rFonts w:ascii="Century Schoolbook" w:hAnsi="Century Schoolbook"/>
           <w:b/>
           <w:bCs/>
         </w:rPr>
@@ -1522,7 +1570,7 @@
         <w:rPr>
           <w:rFonts w:ascii="Century Schoolbook" w:hAnsi="Century Schoolbook"/>
         </w:rPr>
-        <w:t xml:space="preserve"> Yes / No </w:t>
+        <w:t xml:space="preserve"> Yes </w:t>
       </w:r>
     </w:p>
     <w:p>
@@ -1546,6 +1594,12 @@
         </w:rPr>
         <w:t xml:space="preserve"> </w:t>
       </w:r>
+      <w:r>
+        <w:rPr>
+          <w:rFonts w:ascii="Century Schoolbook" w:hAnsi="Century Schoolbook"/>
+        </w:rPr>
+        <w:t>grammar polishing</w:t>
+      </w:r>
     </w:p>
     <w:p>
       <w:pPr>
@@ -1568,20 +1622,48 @@
         </w:rPr>
         <w:t xml:space="preserve"> </w:t>
       </w:r>
-    </w:p>
-    <w:p>
-      <w:pPr>
-        <w:jc w:val="both"/>
-        <w:rPr>
-          <w:rFonts w:ascii="Century Schoolbook" w:hAnsi="Century Schoolbook"/>
-        </w:rPr>
-      </w:pPr>
-      <w:r>
-        <w:rPr>
-          <w:rFonts w:ascii="Century Schoolbook" w:hAnsi="Century Schoolbook"/>
-        </w:rPr>
-        <w:pict w14:anchorId="44A68543">
-          <v:rect id="_x0000_i1028" style="width:0;height:1.5pt" o:hralign="center" o:hrstd="t" o:hr="t" fillcolor="#a0a0a0" stroked="f"/>
+      <w:hyperlink r:id="rId7" w:history="1">
+        <w:r>
+          <w:rPr>
+            <w:rStyle w:val="af2"/>
+            <w:rFonts w:ascii="Century Schoolbook" w:hAnsi="Century Schoolbook"/>
+          </w:rPr>
+          <w:t>https://en.wikipedia</w:t>
+        </w:r>
+        <w:r>
+          <w:rPr>
+            <w:rStyle w:val="af2"/>
+            <w:rFonts w:ascii="Century Schoolbook" w:hAnsi="Century Schoolbook"/>
+          </w:rPr>
+          <w:t>.</w:t>
+        </w:r>
+        <w:r>
+          <w:rPr>
+            <w:rStyle w:val="af2"/>
+            <w:rFonts w:ascii="Century Schoolbook" w:hAnsi="Century Schoolbook"/>
+          </w:rPr>
+          <w:t>org/wiki/Association_rule_learning</w:t>
+        </w:r>
+      </w:hyperlink>
+    </w:p>
+    <w:p>
+      <w:pPr>
+        <w:jc w:val="both"/>
+        <w:rPr>
+          <w:rFonts w:ascii="Century Schoolbook" w:hAnsi="Century Schoolbook"/>
+        </w:rPr>
+      </w:pPr>
+      <w:r>
+        <w:rPr>
+          <w:noProof/>
+        </w:rPr>
+      </w:r>
+      <w:r>
+        <w:pict w14:anchorId="1197277F">
+          <v:rect id="Horizontal Line 4" o:spid="_x0000_s2059" style="width:451.3pt;height:1.1pt;visibility:visible;mso-wrap-style:square;mso-left-percent:-10001;mso-top-percent:-10001;mso-position-horizontal:absolute;mso-position-horizontal-relative:char;mso-position-vertical:absolute;mso-position-vertical-relative:line;mso-left-percent:-10001;mso-top-percent:-10001;v-text-anchor:top" o:gfxdata="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" filled="f">
+            <o:lock v:ext="edit" rotation="t" aspectratio="t" verticies="t" text="t" shapetype="t"/>
+            <w10:anchorlock/>
+          </v:rect>
         </w:pict>
       </w:r>
     </w:p>
@@ -1624,21 +1706,115 @@
         </w:rPr>
         <w:t xml:space="preserve"> Section 4.1 — Question 2 (take home) (after the </w:t>
       </w:r>
-      <w:proofErr w:type="gramStart"/>
-      <w:r>
-        <w:rPr>
-          <w:rFonts w:ascii="Century Schoolbook" w:hAnsi="Century Schoolbook"/>
-          <w:b/>
-          <w:bCs/>
-        </w:rPr>
-        <w:t>dropna(</w:t>
-      </w:r>
-      <w:proofErr w:type="gramEnd"/>
-      <w:r>
-        <w:rPr>
-          <w:rFonts w:ascii="Century Schoolbook" w:hAnsi="Century Schoolbook"/>
-          <w:b/>
-          <w:bCs/>
+      <w:r>
+        <w:rPr>
+          <w:rFonts w:ascii="Century Schoolbook" w:hAnsi="Century Schoolbook"/>
+          <w:b/>
+          <w:bCs/>
+        </w:rPr>
+        <w:t>dropna()</w:t>
+      </w:r>
+      <w:r>
+        <w:rPr>
+          <w:rFonts w:ascii="Century Schoolbook" w:hAnsi="Century Schoolbook"/>
+        </w:rPr>
+        <w:t xml:space="preserve"> demonstration)</w:t>
+      </w:r>
+    </w:p>
+    <w:p>
+      <w:pPr>
+        <w:jc w:val="both"/>
+        <w:rPr>
+          <w:rFonts w:ascii="Century Schoolbook" w:hAnsi="Century Schoolbook"/>
+        </w:rPr>
+      </w:pPr>
+      <w:r>
+        <w:rPr>
+          <w:rFonts w:ascii="Century Schoolbook" w:hAnsi="Century Schoolbook"/>
+          <w:b/>
+          <w:bCs/>
+        </w:rPr>
+        <w:t>Task:</w:t>
+      </w:r>
+      <w:r>
+        <w:rPr>
+          <w:rFonts w:ascii="Century Schoolbook" w:hAnsi="Century Schoolbook"/>
+        </w:rPr>
+        <w:t xml:space="preserve"> </w:t>
+      </w:r>
+      <w:r>
+        <w:rPr>
+          <w:rFonts w:ascii="Century Schoolbook" w:hAnsi="Century Schoolbook"/>
+        </w:rPr>
+        <w:t xml:space="preserve">In Section 4.1, a dummy record with a missing value is injected and then removed using the </w:t>
+      </w:r>
+      <w:r>
+        <w:rPr>
+          <w:rFonts w:ascii="Century Schoolbook" w:hAnsi="Century Schoolbook"/>
+          <w:b/>
+          <w:bCs/>
+        </w:rPr>
+        <w:t>dropna()</w:t>
+      </w:r>
+      <w:r>
+        <w:rPr>
+          <w:rFonts w:ascii="Century Schoolbook" w:hAnsi="Century Schoolbook"/>
+        </w:rPr>
+        <w:t xml:space="preserve"> function.</w:t>
+      </w:r>
+    </w:p>
+    <w:p>
+      <w:pPr>
+        <w:jc w:val="both"/>
+        <w:rPr>
+          <w:rFonts w:ascii="Century Schoolbook" w:hAnsi="Century Schoolbook"/>
+        </w:rPr>
+      </w:pPr>
+      <w:r>
+        <w:rPr>
+          <w:rFonts w:ascii="Century Schoolbook" w:hAnsi="Century Schoolbook"/>
+          <w:b/>
+          <w:bCs/>
+        </w:rPr>
+        <w:t>Question:</w:t>
+      </w:r>
+      <w:r>
+        <w:rPr>
+          <w:rFonts w:ascii="Century Schoolbook" w:hAnsi="Century Schoolbook"/>
+        </w:rPr>
+        <w:t xml:space="preserve"> If 40% of documents were missing the </w:t>
+      </w:r>
+      <w:r>
+        <w:rPr>
+          <w:rFonts w:ascii="Century Schoolbook" w:hAnsi="Century Schoolbook"/>
+          <w:b/>
+          <w:bCs/>
+        </w:rPr>
+        <w:t>category_name</w:t>
+      </w:r>
+      <w:r>
+        <w:rPr>
+          <w:rFonts w:ascii="Century Schoolbook" w:hAnsi="Century Schoolbook"/>
+        </w:rPr>
+        <w:t xml:space="preserve"> label, why would simply dropping these rows (</w:t>
+      </w:r>
+      <w:r>
+        <w:rPr>
+          <w:rFonts w:ascii="Century Schoolbook" w:hAnsi="Century Schoolbook"/>
+        </w:rPr>
+        <w:t xml:space="preserve">with </w:t>
+      </w:r>
+      <w:r>
+        <w:rPr>
+          <w:rFonts w:ascii="Century Schoolbook" w:hAnsi="Century Schoolbook"/>
+          <w:b/>
+          <w:bCs/>
+        </w:rPr>
+        <w:t>dropna()</w:t>
+      </w:r>
+      <w:r>
+        <w:rPr>
+          <w:rFonts w:ascii="Century Schoolbook" w:hAnsi="Century Schoolbook"/>
         </w:rPr>
         <w:t>)</w:t>
       </w:r>
@@ -1646,7 +1822,189 @@
         <w:rPr>
           <w:rFonts w:ascii="Century Schoolbook" w:hAnsi="Century Schoolbook"/>
         </w:rPr>
-        <w:t xml:space="preserve"> demonstration)</w:t>
+        <w:t xml:space="preserve"> be a flawed data mining strategy? Name one objective alternative so the text data can still be utilized.</w:t>
+      </w:r>
+    </w:p>
+    <w:p>
+      <w:pPr>
+        <w:jc w:val="both"/>
+        <w:rPr>
+          <w:rFonts w:ascii="Century Schoolbook" w:hAnsi="Century Schoolbook"/>
+          <w:b/>
+          <w:bCs/>
+        </w:rPr>
+      </w:pPr>
+      <w:r>
+        <w:rPr>
+          <w:rFonts w:ascii="Century Schoolbook" w:hAnsi="Century Schoolbook"/>
+          <w:b/>
+          <w:bCs/>
+        </w:rPr>
+        <w:t>Answer:</w:t>
+      </w:r>
+      <w:r>
+        <w:rPr>
+          <w:rFonts w:ascii="Century Schoolbook" w:hAnsi="Century Schoolbook" w:hint="eastAsia"/>
+          <w:b/>
+          <w:bCs/>
+        </w:rPr>
+        <w:t xml:space="preserve"> </w:t>
+      </w:r>
+    </w:p>
+    <w:p>
+      <w:pPr>
+        <w:jc w:val="both"/>
+        <w:rPr>
+          <w:rFonts w:ascii="Century Schoolbook" w:hAnsi="Century Schoolbook"/>
+        </w:rPr>
+      </w:pPr>
+      <w:r>
+        <w:rPr>
+          <w:rFonts w:ascii="Century Schoolbook" w:hAnsi="Century Schoolbook"/>
+        </w:rPr>
+        <w:t xml:space="preserve">Dropping 40% of the dataset with dropna() throws away too much data and can easily mess up the class balance. Since the text itself is still useful, a better alternative is using an unsupervised method like K-Means clustering to group the documents without needing the category labels. </w:t>
+      </w:r>
+    </w:p>
+    <w:p>
+      <w:pPr>
+        <w:jc w:val="both"/>
+        <w:rPr>
+          <w:rFonts w:ascii="Century Schoolbook" w:hAnsi="Century Schoolbook"/>
+        </w:rPr>
+      </w:pPr>
+      <w:r>
+        <w:rPr>
+          <w:rFonts w:ascii="Century Schoolbook" w:hAnsi="Century Schoolbook"/>
+          <w:b/>
+          <w:bCs/>
+        </w:rPr>
+        <w:t>AI used for this answer:</w:t>
+      </w:r>
+      <w:r>
+        <w:rPr>
+          <w:rFonts w:ascii="Century Schoolbook" w:hAnsi="Century Schoolbook"/>
+        </w:rPr>
+        <w:t xml:space="preserve"> Yes </w:t>
+      </w:r>
+    </w:p>
+    <w:p>
+      <w:pPr>
+        <w:jc w:val="both"/>
+        <w:rPr>
+          <w:rFonts w:ascii="Century Schoolbook" w:hAnsi="Century Schoolbook"/>
+        </w:rPr>
+      </w:pPr>
+      <w:r>
+        <w:rPr>
+          <w:rFonts w:ascii="Century Schoolbook" w:hAnsi="Century Schoolbook"/>
+          <w:b/>
+          <w:bCs/>
+        </w:rPr>
+        <w:t>If yes, how:</w:t>
+      </w:r>
+      <w:r>
+        <w:rPr>
+          <w:rFonts w:ascii="Century Schoolbook" w:hAnsi="Century Schoolbook"/>
+        </w:rPr>
+        <w:t xml:space="preserve"> </w:t>
+      </w:r>
+      <w:r>
+        <w:rPr>
+          <w:rFonts w:ascii="Century Schoolbook" w:hAnsi="Century Schoolbook"/>
+        </w:rPr>
+        <w:t>grammar polishing</w:t>
+      </w:r>
+    </w:p>
+    <w:p>
+      <w:pPr>
+        <w:rPr>
+          <w:rFonts w:ascii="Century Schoolbook" w:hAnsi="Century Schoolbook" w:hint="eastAsia"/>
+        </w:rPr>
+      </w:pPr>
+      <w:r>
+        <w:rPr>
+          <w:rFonts w:ascii="Century Schoolbook" w:hAnsi="Century Schoolbook"/>
+          <w:b/>
+          <w:bCs/>
+        </w:rPr>
+        <w:t>External references (links):</w:t>
+      </w:r>
+      <w:r>
+        <w:rPr>
+          <w:rFonts w:ascii="Century Schoolbook" w:hAnsi="Century Schoolbook"/>
+        </w:rPr>
+        <w:t xml:space="preserve"> </w:t>
+      </w:r>
+      <w:hyperlink r:id="rId8" w:history="1">
+        <w:r>
+          <w:rPr>
+            <w:rStyle w:val="af2"/>
+            <w:rFonts w:ascii="Century Schoolbook" w:hAnsi="Century Schoolbook"/>
+          </w:rPr>
+          <w:t>https://kenndanielso.github.io/mlrefined/blog_posts/11_Linear_unsupervised_learning/11_5_K_means_clustering.html</w:t>
+        </w:r>
+      </w:hyperlink>
+    </w:p>
+    <w:p>
+      <w:pPr>
+        <w:jc w:val="both"/>
+        <w:rPr>
+          <w:rFonts w:ascii="Century Schoolbook" w:hAnsi="Century Schoolbook"/>
+        </w:rPr>
+      </w:pPr>
+      <w:r>
+        <w:rPr>
+          <w:noProof/>
+        </w:rPr>
+      </w:r>
+      <w:r>
+        <w:pict w14:anchorId="6040CBDE">
+          <v:rect id="Horizontal Line 5" o:spid="_x0000_s2058" style="width:451.3pt;height:1.1pt;visibility:visible;mso-wrap-style:square;mso-left-percent:-10001;mso-top-percent:-10001;mso-position-horizontal:absolute;mso-position-horizontal-relative:char;mso-position-vertical:absolute;mso-position-vertical-relative:line;mso-left-percent:-10001;mso-top-percent:-10001;v-text-anchor:top" o:gfxdata="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" filled="f">
+            <o:lock v:ext="edit" rotation="t" aspectratio="t" verticies="t" text="t" shapetype="t"/>
+            <w10:anchorlock/>
+          </v:rect>
+        </w:pict>
+      </w:r>
+    </w:p>
+    <w:p>
+      <w:pPr>
+        <w:jc w:val="both"/>
+        <w:rPr>
+          <w:rFonts w:ascii="Century Schoolbook" w:hAnsi="Century Schoolbook"/>
+          <w:b/>
+          <w:bCs/>
+        </w:rPr>
+      </w:pPr>
+      <w:r>
+        <w:rPr>
+          <w:rFonts w:ascii="Century Schoolbook" w:hAnsi="Century Schoolbook"/>
+          <w:b/>
+          <w:bCs/>
+        </w:rPr>
+        <w:t>Question 3: Data Sampling Risks</w:t>
+      </w:r>
+    </w:p>
+    <w:p>
+      <w:pPr>
+        <w:jc w:val="both"/>
+        <w:rPr>
+          <w:rFonts w:ascii="Century Schoolbook" w:hAnsi="Century Schoolbook"/>
+        </w:rPr>
+      </w:pPr>
+      <w:r>
+        <w:rPr>
+          <w:rFonts w:ascii="Century Schoolbook" w:hAnsi="Century Schoolbook"/>
+          <w:b/>
+          <w:bCs/>
+        </w:rPr>
+        <w:lastRenderedPageBreak/>
+        <w:t>Notebook:</w:t>
+      </w:r>
+      <w:r>
+        <w:rPr>
+          <w:rFonts w:ascii="Century Schoolbook" w:hAnsi="Century Schoolbook"/>
+        </w:rPr>
+        <w:t xml:space="preserve"> Section 5.1 — Question 3 (take home)</w:t>
       </w:r>
     </w:p>
     <w:p>
@@ -1674,392 +2032,15 @@
         <w:rPr>
           <w:rFonts w:ascii="Century Schoolbook" w:hAnsi="Century Schoolbook"/>
         </w:rPr>
-        <w:t xml:space="preserve">In Section 4.1, a dummy record with a missing value is injected and then removed using the </w:t>
-      </w:r>
-      <w:proofErr w:type="spellStart"/>
-      <w:proofErr w:type="gramStart"/>
-      <w:r>
-        <w:rPr>
-          <w:rFonts w:ascii="Century Schoolbook" w:hAnsi="Century Schoolbook"/>
-          <w:b/>
-          <w:bCs/>
-        </w:rPr>
-        <w:t>dropna</w:t>
-      </w:r>
-      <w:proofErr w:type="spellEnd"/>
-      <w:r>
-        <w:rPr>
-          <w:rFonts w:ascii="Century Schoolbook" w:hAnsi="Century Schoolbook"/>
-          <w:b/>
-          <w:bCs/>
-        </w:rPr>
-        <w:t>(</w:t>
-      </w:r>
-      <w:proofErr w:type="gramEnd"/>
-      <w:r>
-        <w:rPr>
-          <w:rFonts w:ascii="Century Schoolbook" w:hAnsi="Century Schoolbook"/>
-          <w:b/>
-          <w:bCs/>
-        </w:rPr>
-        <w:t>)</w:t>
-      </w:r>
-      <w:r>
-        <w:rPr>
-          <w:rFonts w:ascii="Century Schoolbook" w:hAnsi="Century Schoolbook"/>
-        </w:rPr>
-        <w:t xml:space="preserve"> function.</w:t>
-      </w:r>
-    </w:p>
-    <w:p>
-      <w:pPr>
-        <w:jc w:val="both"/>
-        <w:rPr>
-          <w:rFonts w:ascii="Century Schoolbook" w:hAnsi="Century Schoolbook"/>
-        </w:rPr>
-      </w:pPr>
-      <w:r>
-        <w:rPr>
-          <w:rFonts w:ascii="Century Schoolbook" w:hAnsi="Century Schoolbook"/>
-          <w:b/>
-          <w:bCs/>
-        </w:rPr>
-        <w:t>Question:</w:t>
-      </w:r>
-      <w:r>
-        <w:rPr>
-          <w:rFonts w:ascii="Century Schoolbook" w:hAnsi="Century Schoolbook"/>
-        </w:rPr>
-        <w:t xml:space="preserve"> If 40% of documents were missing the </w:t>
-      </w:r>
-      <w:proofErr w:type="spellStart"/>
-      <w:r>
-        <w:rPr>
-          <w:rFonts w:ascii="Century Schoolbook" w:hAnsi="Century Schoolbook"/>
-          <w:b/>
-          <w:bCs/>
-        </w:rPr>
-        <w:t>category_name</w:t>
-      </w:r>
-      <w:proofErr w:type="spellEnd"/>
-      <w:r>
-        <w:rPr>
-          <w:rFonts w:ascii="Century Schoolbook" w:hAnsi="Century Schoolbook"/>
-        </w:rPr>
-        <w:t xml:space="preserve"> label, why would simply dropping these rows (</w:t>
-      </w:r>
-      <w:r>
-        <w:rPr>
-          <w:rFonts w:ascii="Century Schoolbook" w:hAnsi="Century Schoolbook"/>
-        </w:rPr>
-        <w:t xml:space="preserve">with </w:t>
-      </w:r>
-      <w:proofErr w:type="spellStart"/>
-      <w:proofErr w:type="gramStart"/>
-      <w:r>
-        <w:rPr>
-          <w:rFonts w:ascii="Century Schoolbook" w:hAnsi="Century Schoolbook"/>
-          <w:b/>
-          <w:bCs/>
-        </w:rPr>
-        <w:t>dropna</w:t>
-      </w:r>
-      <w:proofErr w:type="spellEnd"/>
-      <w:r>
-        <w:rPr>
-          <w:rFonts w:ascii="Century Schoolbook" w:hAnsi="Century Schoolbook"/>
-          <w:b/>
-          <w:bCs/>
-        </w:rPr>
-        <w:t>(</w:t>
-      </w:r>
-      <w:proofErr w:type="gramEnd"/>
-      <w:r>
-        <w:rPr>
-          <w:rFonts w:ascii="Century Schoolbook" w:hAnsi="Century Schoolbook"/>
-          <w:b/>
-          <w:bCs/>
-        </w:rPr>
-        <w:t>)</w:t>
-      </w:r>
-      <w:r>
-        <w:rPr>
-          <w:rFonts w:ascii="Century Schoolbook" w:hAnsi="Century Schoolbook"/>
-        </w:rPr>
-        <w:t>)</w:t>
-      </w:r>
-      <w:r>
-        <w:rPr>
-          <w:rFonts w:ascii="Century Schoolbook" w:hAnsi="Century Schoolbook"/>
-        </w:rPr>
-        <w:t xml:space="preserve"> be a flawed data mining strategy? Name one objective alternative so the text data can still be utilized.</w:t>
-      </w:r>
-    </w:p>
-    <w:p>
-      <w:pPr>
-        <w:jc w:val="both"/>
-        <w:rPr>
-          <w:rFonts w:ascii="Century Schoolbook" w:hAnsi="Century Schoolbook"/>
-        </w:rPr>
-      </w:pPr>
-      <w:r>
-        <w:rPr>
-          <w:rFonts w:ascii="Century Schoolbook" w:hAnsi="Century Schoolbook"/>
-          <w:b/>
-          <w:bCs/>
-        </w:rPr>
-        <w:t>Answer:</w:t>
-      </w:r>
-    </w:p>
-    <w:p>
-      <w:pPr>
-        <w:jc w:val="both"/>
-        <w:rPr>
-          <w:rFonts w:ascii="Century Schoolbook" w:hAnsi="Century Schoolbook"/>
-        </w:rPr>
-      </w:pPr>
-      <w:r>
-        <w:rPr>
-          <w:rFonts w:ascii="Century Schoolbook" w:hAnsi="Century Schoolbook"/>
-          <w:b/>
-          <w:bCs/>
-        </w:rPr>
-        <w:t>AI used for this answer:</w:t>
-      </w:r>
-      <w:r>
-        <w:rPr>
-          <w:rFonts w:ascii="Century Schoolbook" w:hAnsi="Century Schoolbook"/>
-        </w:rPr>
-        <w:t xml:space="preserve"> Yes / No </w:t>
-      </w:r>
-    </w:p>
-    <w:p>
-      <w:pPr>
-        <w:jc w:val="both"/>
-        <w:rPr>
-          <w:rFonts w:ascii="Century Schoolbook" w:hAnsi="Century Schoolbook"/>
-        </w:rPr>
-      </w:pPr>
-      <w:r>
-        <w:rPr>
-          <w:rFonts w:ascii="Century Schoolbook" w:hAnsi="Century Schoolbook"/>
-          <w:b/>
-          <w:bCs/>
-        </w:rPr>
-        <w:t>If yes, how:</w:t>
-      </w:r>
-      <w:r>
-        <w:rPr>
-          <w:rFonts w:ascii="Century Schoolbook" w:hAnsi="Century Schoolbook"/>
-        </w:rPr>
-        <w:t xml:space="preserve"> </w:t>
-      </w:r>
-    </w:p>
-    <w:p>
-      <w:pPr>
-        <w:jc w:val="both"/>
-        <w:rPr>
-          <w:rFonts w:ascii="Century Schoolbook" w:hAnsi="Century Schoolbook"/>
-        </w:rPr>
-      </w:pPr>
-      <w:r>
-        <w:rPr>
-          <w:rFonts w:ascii="Century Schoolbook" w:hAnsi="Century Schoolbook"/>
-          <w:b/>
-          <w:bCs/>
-        </w:rPr>
-        <w:t>External references (links):</w:t>
-      </w:r>
-      <w:r>
-        <w:rPr>
-          <w:rFonts w:ascii="Century Schoolbook" w:hAnsi="Century Schoolbook"/>
-        </w:rPr>
-        <w:t xml:space="preserve"> </w:t>
-      </w:r>
-    </w:p>
-    <w:p>
-      <w:pPr>
-        <w:jc w:val="both"/>
-        <w:rPr>
-          <w:rFonts w:ascii="Century Schoolbook" w:hAnsi="Century Schoolbook"/>
-        </w:rPr>
-      </w:pPr>
-    </w:p>
-    <w:p>
-      <w:pPr>
-        <w:jc w:val="both"/>
-        <w:rPr>
-          <w:rFonts w:ascii="Century Schoolbook" w:hAnsi="Century Schoolbook"/>
-        </w:rPr>
-      </w:pPr>
-    </w:p>
-    <w:p>
-      <w:pPr>
-        <w:jc w:val="both"/>
-        <w:rPr>
-          <w:rFonts w:ascii="Century Schoolbook" w:hAnsi="Century Schoolbook"/>
-        </w:rPr>
-      </w:pPr>
-    </w:p>
-    <w:p>
-      <w:pPr>
-        <w:jc w:val="both"/>
-        <w:rPr>
-          <w:rFonts w:ascii="Century Schoolbook" w:hAnsi="Century Schoolbook"/>
-        </w:rPr>
-      </w:pPr>
-    </w:p>
-    <w:p>
-      <w:pPr>
-        <w:jc w:val="both"/>
-        <w:rPr>
-          <w:rFonts w:ascii="Century Schoolbook" w:hAnsi="Century Schoolbook"/>
-        </w:rPr>
-      </w:pPr>
-    </w:p>
-    <w:p>
-      <w:pPr>
-        <w:jc w:val="both"/>
-        <w:rPr>
-          <w:rFonts w:ascii="Century Schoolbook" w:hAnsi="Century Schoolbook"/>
-        </w:rPr>
-      </w:pPr>
-    </w:p>
-    <w:p>
-      <w:pPr>
-        <w:jc w:val="both"/>
-        <w:rPr>
-          <w:rFonts w:ascii="Century Schoolbook" w:hAnsi="Century Schoolbook"/>
-        </w:rPr>
-      </w:pPr>
-    </w:p>
-    <w:p>
-      <w:pPr>
-        <w:jc w:val="both"/>
-        <w:rPr>
-          <w:rFonts w:ascii="Century Schoolbook" w:hAnsi="Century Schoolbook"/>
-        </w:rPr>
-      </w:pPr>
-    </w:p>
-    <w:p>
-      <w:pPr>
-        <w:jc w:val="both"/>
-        <w:rPr>
-          <w:rFonts w:ascii="Century Schoolbook" w:hAnsi="Century Schoolbook"/>
-        </w:rPr>
-      </w:pPr>
-      <w:r>
-        <w:rPr>
-          <w:rFonts w:ascii="Century Schoolbook" w:hAnsi="Century Schoolbook"/>
-        </w:rPr>
-        <w:lastRenderedPageBreak/>
-        <w:pict w14:anchorId="4353243F">
-          <v:rect id="_x0000_i1029" style="width:0;height:1.5pt" o:hralign="center" o:hrstd="t" o:hr="t" fillcolor="#a0a0a0" stroked="f"/>
-        </w:pict>
-      </w:r>
-    </w:p>
-    <w:p>
-      <w:pPr>
-        <w:jc w:val="both"/>
-        <w:rPr>
-          <w:rFonts w:ascii="Century Schoolbook" w:hAnsi="Century Schoolbook"/>
-          <w:b/>
-          <w:bCs/>
-        </w:rPr>
-      </w:pPr>
-      <w:r>
-        <w:rPr>
-          <w:rFonts w:ascii="Century Schoolbook" w:hAnsi="Century Schoolbook"/>
-          <w:b/>
-          <w:bCs/>
-        </w:rPr>
-        <w:t>Question 3: Data Sampling Risks</w:t>
-      </w:r>
-    </w:p>
-    <w:p>
-      <w:pPr>
-        <w:jc w:val="both"/>
-        <w:rPr>
-          <w:rFonts w:ascii="Century Schoolbook" w:hAnsi="Century Schoolbook"/>
-        </w:rPr>
-      </w:pPr>
-      <w:r>
-        <w:rPr>
-          <w:rFonts w:ascii="Century Schoolbook" w:hAnsi="Century Schoolbook"/>
-          <w:b/>
-          <w:bCs/>
-        </w:rPr>
-        <w:t>Notebook:</w:t>
-      </w:r>
-      <w:r>
-        <w:rPr>
-          <w:rFonts w:ascii="Century Schoolbook" w:hAnsi="Century Schoolbook"/>
-        </w:rPr>
-        <w:t xml:space="preserve"> Section 5.1 — Question 3 (take home)</w:t>
-      </w:r>
-    </w:p>
-    <w:p>
-      <w:pPr>
-        <w:jc w:val="both"/>
-        <w:rPr>
-          <w:rFonts w:ascii="Century Schoolbook" w:hAnsi="Century Schoolbook"/>
-        </w:rPr>
-      </w:pPr>
-      <w:r>
-        <w:rPr>
-          <w:rFonts w:ascii="Century Schoolbook" w:hAnsi="Century Schoolbook"/>
-          <w:b/>
-          <w:bCs/>
-        </w:rPr>
-        <w:t>Task:</w:t>
-      </w:r>
-      <w:r>
-        <w:rPr>
-          <w:rFonts w:ascii="Century Schoolbook" w:hAnsi="Century Schoolbook"/>
-        </w:rPr>
-        <w:t xml:space="preserve"> </w:t>
-      </w:r>
-      <w:r>
-        <w:rPr>
-          <w:rFonts w:ascii="Century Schoolbook" w:hAnsi="Century Schoolbook"/>
-        </w:rPr>
         <w:t xml:space="preserve">In Section 5.1, the code uses </w:t>
       </w:r>
-      <w:proofErr w:type="spellStart"/>
-      <w:r>
-        <w:rPr>
-          <w:rFonts w:ascii="Century Schoolbook" w:hAnsi="Century Schoolbook"/>
-          <w:b/>
-          <w:bCs/>
-        </w:rPr>
-        <w:t>X_sample</w:t>
-      </w:r>
-      <w:proofErr w:type="spellEnd"/>
-      <w:r>
-        <w:rPr>
-          <w:rFonts w:ascii="Century Schoolbook" w:hAnsi="Century Schoolbook"/>
-          <w:b/>
-          <w:bCs/>
-        </w:rPr>
-        <w:t xml:space="preserve"> = </w:t>
-      </w:r>
-      <w:proofErr w:type="spellStart"/>
-      <w:r>
-        <w:rPr>
-          <w:rFonts w:ascii="Century Schoolbook" w:hAnsi="Century Schoolbook"/>
-          <w:b/>
-          <w:bCs/>
-        </w:rPr>
-        <w:t>X.sample</w:t>
-      </w:r>
-      <w:proofErr w:type="spellEnd"/>
-      <w:r>
-        <w:rPr>
-          <w:rFonts w:ascii="Century Schoolbook" w:hAnsi="Century Schoolbook"/>
-          <w:b/>
-          <w:bCs/>
-        </w:rPr>
-        <w:t>(n=1000)</w:t>
+      <w:r>
+        <w:rPr>
+          <w:rFonts w:ascii="Century Schoolbook" w:hAnsi="Century Schoolbook"/>
+          <w:b/>
+          <w:bCs/>
+        </w:rPr>
+        <w:t>X_sample = X.sample(n=1000)</w:t>
       </w:r>
       <w:r>
         <w:rPr>
@@ -2137,6 +2118,64 @@
         </w:rPr>
         <w:t>Answer:</w:t>
       </w:r>
+      <w:r>
+        <w:rPr>
+          <w:rFonts w:ascii="Century Schoolbook" w:hAnsi="Century Schoolbook"/>
+          <w:b/>
+          <w:bCs/>
+        </w:rPr>
+        <w:br/>
+      </w:r>
+      <w:r>
+        <w:rPr>
+          <w:rFonts w:ascii="Century Schoolbook" w:hAnsi="Century Schoolbook"/>
+        </w:rPr>
+        <w:t xml:space="preserve">1, </w:t>
+      </w:r>
+      <w:r>
+        <w:rPr>
+          <w:rFonts w:ascii="Century Schoolbook" w:hAnsi="Century Schoolbook" w:hint="eastAsia"/>
+        </w:rPr>
+        <w:t>N</w:t>
+      </w:r>
+      <w:r>
+        <w:rPr>
+          <w:rFonts w:ascii="Century Schoolbook" w:hAnsi="Century Schoolbook"/>
+        </w:rPr>
+        <w:t>o, the sampled proportions don't match the original perfectly due to random sampling variance, even though they stay within an acceptable range.</w:t>
+      </w:r>
+    </w:p>
+    <w:p>
+      <w:pPr>
+        <w:jc w:val="both"/>
+        <w:rPr>
+          <w:rFonts w:ascii="Century Schoolbook" w:hAnsi="Century Schoolbook"/>
+        </w:rPr>
+      </w:pPr>
+      <w:r>
+        <w:rPr>
+          <w:rFonts w:ascii="Century Schoolbook" w:hAnsi="Century Schoolbook"/>
+        </w:rPr>
+        <w:t xml:space="preserve">2, </w:t>
+      </w:r>
+      <w:r>
+        <w:rPr>
+          <w:rFonts w:ascii="Century Schoolbook" w:hAnsi="Century Schoolbook"/>
+        </w:rPr>
+        <w:t>The main risk is that simple random sampling can easily underrepresent or completely miss minority classes, making the sampled dataset</w:t>
+      </w:r>
+      <w:r>
+        <w:rPr>
+          <w:rFonts w:ascii="Century Schoolbook" w:hAnsi="Century Schoolbook"/>
+        </w:rPr>
+        <w:t xml:space="preserve"> </w:t>
+      </w:r>
+      <w:r>
+        <w:rPr>
+          <w:rFonts w:ascii="Century Schoolbook" w:hAnsi="Century Schoolbook"/>
+        </w:rPr>
+        <w:t>imbalanced and hiding rare but important patterns.</w:t>
+      </w:r>
     </w:p>
     <w:p>
       <w:pPr>
@@ -2157,7 +2196,7 @@
         <w:rPr>
           <w:rFonts w:ascii="Century Schoolbook" w:hAnsi="Century Schoolbook"/>
         </w:rPr>
-        <w:t xml:space="preserve"> Yes / No </w:t>
+        <w:t xml:space="preserve"> No </w:t>
       </w:r>
     </w:p>
     <w:p>
@@ -2213,10 +2252,15 @@
       </w:pPr>
       <w:r>
         <w:rPr>
-          <w:rFonts w:ascii="Century Schoolbook" w:hAnsi="Century Schoolbook"/>
-        </w:rPr>
-        <w:pict w14:anchorId="67A2549C">
-          <v:rect id="_x0000_i1030" style="width:0;height:1.5pt" o:hralign="center" o:hrstd="t" o:hr="t" fillcolor="#a0a0a0" stroked="f"/>
+          <w:noProof/>
+        </w:rPr>
+      </w:r>
+      <w:r>
+        <w:pict w14:anchorId="7A118A68">
+          <v:rect id="Horizontal Line 6" o:spid="_x0000_s2057" style="width:451.3pt;height:1.1pt;visibility:visible;mso-wrap-style:square;mso-left-percent:-10001;mso-top-percent:-10001;mso-position-horizontal:absolute;mso-position-horizontal-relative:char;mso-position-vertical:absolute;mso-position-vertical-relative:line;mso-left-percent:-10001;mso-top-percent:-10001;v-text-anchor:top" o:gfxdata="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" filled="f">
+            <o:lock v:ext="edit" rotation="t" aspectratio="t" verticies="t" text="t" shapetype="t"/>
+            <w10:anchorlock/>
+          </v:rect>
         </w:pict>
       </w:r>
     </w:p>
@@ -2264,7 +2308,7 @@
       <w:pPr>
         <w:jc w:val="both"/>
         <w:rPr>
-          <w:rFonts w:ascii="Century Schoolbook" w:hAnsi="Century Schoolbook"/>
+          <w:rFonts w:ascii="Century Schoolbook" w:hAnsi="Century Schoolbook" w:hint="eastAsia"/>
         </w:rPr>
       </w:pPr>
       <w:r>
@@ -2287,7 +2331,6 @@
         </w:rPr>
         <w:t xml:space="preserve">In Section 5.3, the </w:t>
       </w:r>
-      <w:proofErr w:type="spellStart"/>
       <w:r>
         <w:rPr>
           <w:rFonts w:ascii="Century Schoolbook" w:hAnsi="Century Schoolbook"/>
@@ -2296,48 +2339,19 @@
         </w:rPr>
         <w:t>CountVectorizer</w:t>
       </w:r>
-      <w:proofErr w:type="spellEnd"/>
       <w:r>
         <w:rPr>
           <w:rFonts w:ascii="Century Schoolbook" w:hAnsi="Century Schoolbook"/>
         </w:rPr>
         <w:t xml:space="preserve"> converts text into a document-term matrix using </w:t>
       </w:r>
-      <w:proofErr w:type="spellStart"/>
-      <w:r>
-        <w:rPr>
-          <w:rFonts w:ascii="Century Schoolbook" w:hAnsi="Century Schoolbook"/>
-          <w:b/>
-          <w:bCs/>
-        </w:rPr>
-        <w:t>stop_words</w:t>
-      </w:r>
-      <w:proofErr w:type="spellEnd"/>
-      <w:r>
-        <w:rPr>
-          <w:rFonts w:ascii="Century Schoolbook" w:hAnsi="Century Schoolbook"/>
-          <w:b/>
-          <w:bCs/>
-        </w:rPr>
-        <w:t>='</w:t>
-      </w:r>
-      <w:proofErr w:type="spellStart"/>
-      <w:r>
-        <w:rPr>
-          <w:rFonts w:ascii="Century Schoolbook" w:hAnsi="Century Schoolbook"/>
-          <w:b/>
-          <w:bCs/>
-        </w:rPr>
-        <w:t>english</w:t>
-      </w:r>
-      <w:proofErr w:type="spellEnd"/>
-      <w:r>
-        <w:rPr>
-          <w:rFonts w:ascii="Century Schoolbook" w:hAnsi="Century Schoolbook"/>
-          <w:b/>
-          <w:bCs/>
-        </w:rPr>
-        <w:t>’</w:t>
+      <w:r>
+        <w:rPr>
+          <w:rFonts w:ascii="Century Schoolbook" w:hAnsi="Century Schoolbook"/>
+          <w:b/>
+          <w:bCs/>
+        </w:rPr>
+        <w:t>stop_words='english’</w:t>
       </w:r>
       <w:r>
         <w:rPr>
@@ -2345,23 +2359,13 @@
         </w:rPr>
         <w:t xml:space="preserve">. Change this parameter to </w:t>
       </w:r>
-      <w:proofErr w:type="spellStart"/>
-      <w:r>
-        <w:rPr>
-          <w:rFonts w:ascii="Century Schoolbook" w:hAnsi="Century Schoolbook"/>
-          <w:b/>
-          <w:bCs/>
-        </w:rPr>
-        <w:t>stop_words</w:t>
-      </w:r>
-      <w:proofErr w:type="spellEnd"/>
-      <w:r>
-        <w:rPr>
-          <w:rFonts w:ascii="Century Schoolbook" w:hAnsi="Century Schoolbook"/>
-          <w:b/>
-          <w:bCs/>
-        </w:rPr>
-        <w:t>=None</w:t>
+      <w:r>
+        <w:rPr>
+          <w:rFonts w:ascii="Century Schoolbook" w:hAnsi="Century Schoolbook"/>
+          <w:b/>
+          <w:bCs/>
+        </w:rPr>
+        <w:t>stop_words=None</w:t>
       </w:r>
       <w:r>
         <w:rPr>
@@ -2369,7 +2373,6 @@
         </w:rPr>
         <w:t xml:space="preserve"> and re-run the cell to check the shape of </w:t>
       </w:r>
-      <w:proofErr w:type="spellStart"/>
       <w:r>
         <w:rPr>
           <w:rFonts w:ascii="Century Schoolbook" w:hAnsi="Century Schoolbook"/>
@@ -2378,21 +2381,12 @@
         </w:rPr>
         <w:t>X_counts</w:t>
       </w:r>
-      <w:proofErr w:type="spellEnd"/>
       <w:r>
         <w:rPr>
           <w:rFonts w:ascii="Century Schoolbook" w:hAnsi="Century Schoolbook"/>
         </w:rPr>
         <w:t>.</w:t>
       </w:r>
-    </w:p>
-    <w:p>
-      <w:pPr>
-        <w:jc w:val="both"/>
-        <w:rPr>
-          <w:rFonts w:ascii="Century Schoolbook" w:hAnsi="Century Schoolbook"/>
-        </w:rPr>
-      </w:pPr>
     </w:p>
     <w:p>
       <w:pPr>
@@ -2457,28 +2451,16 @@
         <w:rPr>
           <w:rFonts w:ascii="Century Schoolbook" w:hAnsi="Century Schoolbook"/>
         </w:rPr>
-        <w:t xml:space="preserve">Since </w:t>
-      </w:r>
-      <w:proofErr w:type="spellStart"/>
-      <w:r>
-        <w:rPr>
-          <w:rFonts w:ascii="Century Schoolbook" w:hAnsi="Century Schoolbook"/>
-        </w:rPr>
-        <w:t>stopwords</w:t>
-      </w:r>
-      <w:proofErr w:type="spellEnd"/>
-      <w:r>
-        <w:rPr>
-          <w:rFonts w:ascii="Century Schoolbook" w:hAnsi="Century Schoolbook"/>
-        </w:rPr>
-        <w:t xml:space="preserve"> are highly common words that appear in almost all documents, what effect does adding them back have on the overall sparsity (the percentage of zeros) of the matrix?</w:t>
-      </w:r>
-    </w:p>
-    <w:p>
-      <w:pPr>
-        <w:jc w:val="both"/>
-        <w:rPr>
-          <w:rFonts w:ascii="Century Schoolbook" w:hAnsi="Century Schoolbook"/>
+        <w:t>Since stopwords are highly common words that appear in almost all documents, what effect does adding them back have on the overall sparsity (the percentage of zeros) of the matrix?</w:t>
+      </w:r>
+    </w:p>
+    <w:p>
+      <w:pPr>
+        <w:jc w:val="both"/>
+        <w:rPr>
+          <w:rFonts w:ascii="Century Schoolbook" w:hAnsi="Century Schoolbook"/>
+          <w:b/>
+          <w:bCs/>
         </w:rPr>
       </w:pPr>
       <w:r>
@@ -2500,6 +2482,64 @@
       <w:r>
         <w:rPr>
           <w:rFonts w:ascii="Century Schoolbook" w:hAnsi="Century Schoolbook"/>
+        </w:rPr>
+        <w:t xml:space="preserve">1, </w:t>
+      </w:r>
+      <w:r>
+        <w:rPr>
+          <w:rFonts w:ascii="Century Schoolbook" w:hAnsi="Century Schoolbook" w:hint="eastAsia"/>
+        </w:rPr>
+        <w:t>T</w:t>
+      </w:r>
+      <w:r>
+        <w:rPr>
+          <w:rFonts w:ascii="Century Schoolbook" w:hAnsi="Century Schoolbook"/>
+        </w:rPr>
+        <w:t>he total number of features</w:t>
+      </w:r>
+      <w:r>
+        <w:rPr>
+          <w:rFonts w:ascii="Century Schoolbook" w:hAnsi="Century Schoolbook"/>
+        </w:rPr>
+        <w:t xml:space="preserve"> </w:t>
+      </w:r>
+      <w:r>
+        <w:rPr>
+          <w:rFonts w:ascii="Century Schoolbook" w:hAnsi="Century Schoolbook"/>
+        </w:rPr>
+        <w:t xml:space="preserve">increases because all the common words that were previously filtered out are included in the vocabulary. </w:t>
+      </w:r>
+    </w:p>
+    <w:p>
+      <w:pPr>
+        <w:jc w:val="both"/>
+        <w:rPr>
+          <w:rFonts w:ascii="Century Schoolbook" w:hAnsi="Century Schoolbook"/>
+        </w:rPr>
+      </w:pPr>
+      <w:r>
+        <w:rPr>
+          <w:rFonts w:ascii="Century Schoolbook" w:hAnsi="Century Schoolbook"/>
+        </w:rPr>
+        <w:t>2,</w:t>
+      </w:r>
+      <w:r>
+        <w:rPr>
+          <w:rFonts w:ascii="Century Schoolbook" w:hAnsi="Century Schoolbook"/>
+        </w:rPr>
+        <w:t xml:space="preserve"> Adding stopwords back slightly decreases the overall sparsity of the matrix, because these words appear frequently across almost every single document, creating many non-zero entries. </w:t>
+      </w:r>
+    </w:p>
+    <w:p>
+      <w:pPr>
+        <w:jc w:val="both"/>
+        <w:rPr>
+          <w:rFonts w:ascii="Century Schoolbook" w:hAnsi="Century Schoolbook"/>
+        </w:rPr>
+      </w:pPr>
+      <w:r>
+        <w:rPr>
+          <w:rFonts w:ascii="Century Schoolbook" w:hAnsi="Century Schoolbook"/>
           <w:b/>
           <w:bCs/>
         </w:rPr>
@@ -2509,7 +2549,7 @@
         <w:rPr>
           <w:rFonts w:ascii="Century Schoolbook" w:hAnsi="Century Schoolbook"/>
         </w:rPr>
-        <w:t xml:space="preserve"> Yes / No </w:t>
+        <w:t xml:space="preserve"> Yes </w:t>
       </w:r>
     </w:p>
     <w:p>
@@ -2533,10 +2573,15 @@
         </w:rPr>
         <w:t xml:space="preserve"> </w:t>
       </w:r>
-    </w:p>
-    <w:p>
-      <w:pPr>
-        <w:jc w:val="both"/>
+      <w:r>
+        <w:rPr>
+          <w:rFonts w:ascii="Century Schoolbook" w:hAnsi="Century Schoolbook"/>
+        </w:rPr>
+        <w:t>Concept explanation</w:t>
+      </w:r>
+    </w:p>
+    <w:p>
+      <w:pPr>
         <w:rPr>
           <w:rFonts w:ascii="Century Schoolbook" w:hAnsi="Century Schoolbook"/>
         </w:rPr>
@@ -2555,87 +2600,81 @@
         </w:rPr>
         <w:t xml:space="preserve"> </w:t>
       </w:r>
-    </w:p>
-    <w:p>
-      <w:pPr>
-        <w:jc w:val="both"/>
-        <w:rPr>
-          <w:rFonts w:ascii="Century Schoolbook" w:hAnsi="Century Schoolbook"/>
-        </w:rPr>
-      </w:pPr>
-    </w:p>
-    <w:p>
-      <w:pPr>
-        <w:jc w:val="both"/>
-        <w:rPr>
-          <w:rFonts w:ascii="Century Schoolbook" w:hAnsi="Century Schoolbook"/>
-        </w:rPr>
-      </w:pPr>
-    </w:p>
-    <w:p>
-      <w:pPr>
-        <w:jc w:val="both"/>
-        <w:rPr>
-          <w:rFonts w:ascii="Century Schoolbook" w:hAnsi="Century Schoolbook"/>
-        </w:rPr>
-      </w:pPr>
-    </w:p>
-    <w:p>
-      <w:pPr>
-        <w:jc w:val="both"/>
-        <w:rPr>
-          <w:rFonts w:ascii="Century Schoolbook" w:hAnsi="Century Schoolbook"/>
-        </w:rPr>
-      </w:pPr>
-    </w:p>
-    <w:p>
-      <w:pPr>
-        <w:jc w:val="both"/>
-        <w:rPr>
-          <w:rFonts w:ascii="Century Schoolbook" w:hAnsi="Century Schoolbook"/>
-        </w:rPr>
-      </w:pPr>
-    </w:p>
-    <w:p>
-      <w:pPr>
-        <w:jc w:val="both"/>
-        <w:rPr>
-          <w:rFonts w:ascii="Century Schoolbook" w:hAnsi="Century Schoolbook"/>
-        </w:rPr>
-      </w:pPr>
-    </w:p>
-    <w:p>
-      <w:pPr>
-        <w:jc w:val="both"/>
-        <w:rPr>
-          <w:rFonts w:ascii="Century Schoolbook" w:hAnsi="Century Schoolbook"/>
-        </w:rPr>
-      </w:pPr>
-      <w:r>
-        <w:rPr>
-          <w:rFonts w:ascii="Century Schoolbook" w:hAnsi="Century Schoolbook"/>
+      <w:hyperlink r:id="rId9" w:history="1">
+        <w:r>
+          <w:rPr>
+            <w:rStyle w:val="af2"/>
+            <w:rFonts w:ascii="Century Schoolbook" w:hAnsi="Century Schoolbook"/>
+          </w:rPr>
+          <w:t>https://scikit</w:t>
+        </w:r>
+        <w:r>
+          <w:rPr>
+            <w:rStyle w:val="af2"/>
+            <w:rFonts w:ascii="Century Schoolbook" w:hAnsi="Century Schoolbook"/>
+          </w:rPr>
+          <w:t>-</w:t>
+        </w:r>
+        <w:r>
+          <w:rPr>
+            <w:rStyle w:val="af2"/>
+            <w:rFonts w:ascii="Century Schoolbook" w:hAnsi="Century Schoolbook"/>
+          </w:rPr>
+          <w:t>learn.org/stable/modules/generated/skle</w:t>
+        </w:r>
+        <w:r>
+          <w:rPr>
+            <w:rStyle w:val="af2"/>
+            <w:rFonts w:ascii="Century Schoolbook" w:hAnsi="Century Schoolbook"/>
+          </w:rPr>
+          <w:t>a</w:t>
+        </w:r>
+        <w:r>
+          <w:rPr>
+            <w:rStyle w:val="af2"/>
+            <w:rFonts w:ascii="Century Schoolbook" w:hAnsi="Century Schoolbook"/>
+          </w:rPr>
+          <w:t>rn.feature_selection.VarianceThreshold.html</w:t>
+        </w:r>
+      </w:hyperlink>
+    </w:p>
+    <w:p>
+      <w:pPr>
+        <w:jc w:val="both"/>
+        <w:rPr>
+          <w:rFonts w:ascii="Century Schoolbook" w:hAnsi="Century Schoolbook"/>
+        </w:rPr>
+      </w:pPr>
+      <w:r>
+        <w:rPr>
+          <w:noProof/>
+        </w:rPr>
+      </w:r>
+      <w:r>
+        <w:pict w14:anchorId="6759FB7D">
+          <v:rect id="Horizontal Line 7" o:spid="_x0000_s2056" style="width:451.3pt;height:1.1pt;visibility:visible;mso-wrap-style:square;mso-left-percent:-10001;mso-top-percent:-10001;mso-position-horizontal:absolute;mso-position-horizontal-relative:char;mso-position-vertical:absolute;mso-position-vertical-relative:line;mso-left-percent:-10001;mso-top-percent:-10001;v-text-anchor:top" o:gfxdata="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" filled="f">
+            <o:lock v:ext="edit" rotation="t" aspectratio="t" verticies="t" text="t" shapetype="t"/>
+            <w10:anchorlock/>
+          </v:rect>
+        </w:pict>
+      </w:r>
+    </w:p>
+    <w:p>
+      <w:pPr>
+        <w:jc w:val="both"/>
+        <w:rPr>
+          <w:rFonts w:ascii="Century Schoolbook" w:hAnsi="Century Schoolbook"/>
+          <w:b/>
+          <w:bCs/>
+        </w:rPr>
+      </w:pPr>
+      <w:r>
+        <w:rPr>
+          <w:rFonts w:ascii="Century Schoolbook" w:hAnsi="Century Schoolbook"/>
+          <w:b/>
+          <w:bCs/>
         </w:rPr>
         <w:lastRenderedPageBreak/>
-        <w:pict w14:anchorId="5994C8B3">
-          <v:rect id="_x0000_i1031" style="width:0;height:1.5pt" o:hralign="center" o:hrstd="t" o:hr="t" fillcolor="#a0a0a0" stroked="f"/>
-        </w:pict>
-      </w:r>
-    </w:p>
-    <w:p>
-      <w:pPr>
-        <w:jc w:val="both"/>
-        <w:rPr>
-          <w:rFonts w:ascii="Century Schoolbook" w:hAnsi="Century Schoolbook"/>
-          <w:b/>
-          <w:bCs/>
-        </w:rPr>
-      </w:pPr>
-      <w:r>
-        <w:rPr>
-          <w:rFonts w:ascii="Century Schoolbook" w:hAnsi="Century Schoolbook"/>
-          <w:b/>
-          <w:bCs/>
-        </w:rPr>
         <w:t xml:space="preserve">Question 5: </w:t>
       </w:r>
       <w:r>
@@ -2704,23 +2743,13 @@
         </w:rPr>
         <w:t xml:space="preserve">In the variance filtering section, re-run </w:t>
       </w:r>
-      <w:proofErr w:type="spellStart"/>
-      <w:r>
-        <w:rPr>
-          <w:rFonts w:ascii="Century Schoolbook" w:hAnsi="Century Schoolbook"/>
-          <w:b/>
-          <w:bCs/>
-        </w:rPr>
-        <w:t>variance_filter</w:t>
-      </w:r>
-      <w:proofErr w:type="spellEnd"/>
-      <w:r>
-        <w:rPr>
-          <w:rFonts w:ascii="Century Schoolbook" w:hAnsi="Century Schoolbook"/>
-          <w:b/>
-          <w:bCs/>
-        </w:rPr>
-        <w:t xml:space="preserve"> </w:t>
+      <w:r>
+        <w:rPr>
+          <w:rFonts w:ascii="Century Schoolbook" w:hAnsi="Century Schoolbook"/>
+          <w:b/>
+          <w:bCs/>
+        </w:rPr>
+        <w:t xml:space="preserve">variance_filter </w:t>
       </w:r>
       <w:r>
         <w:rPr>
@@ -2789,7 +2818,19 @@
         <w:rPr>
           <w:rFonts w:ascii="Century Schoolbook" w:hAnsi="Century Schoolbook"/>
         </w:rPr>
-        <w:t>What happens to the total size of the vocabulary as the variance threshold increases from 0.0 to 0.05?</w:t>
+        <w:t xml:space="preserve">What happens to the total size of the vocabulary as the variance threshold </w:t>
+      </w:r>
+      <w:r>
+        <w:rPr>
+          <w:rFonts w:ascii="Century Schoolbook" w:hAnsi="Century Schoolbook"/>
+        </w:rPr>
+        <w:t>5k4</w:t>
+      </w:r>
+      <w:r>
+        <w:rPr>
+          <w:rFonts w:ascii="Century Schoolbook" w:hAnsi="Century Schoolbook"/>
+        </w:rPr>
+        <w:t>increases from 0.0 to 0.05?</w:t>
       </w:r>
     </w:p>
     <w:p>
@@ -2941,6 +2982,12 @@
               </w:rPr>
               <w:t>0.0</w:t>
             </w:r>
+            <w:r>
+              <w:rPr>
+                <w:rFonts w:ascii="Century Schoolbook" w:hAnsi="Century Schoolbook"/>
+              </w:rPr>
+              <w:t>=35482</w:t>
+            </w:r>
           </w:p>
         </w:tc>
         <w:tc>
@@ -2981,6 +3028,12 @@
                 <w:rFonts w:ascii="Century Schoolbook" w:hAnsi="Century Schoolbook"/>
               </w:rPr>
               <w:t>0.01</w:t>
+            </w:r>
+            <w:r>
+              <w:rPr>
+                <w:rFonts w:ascii="Century Schoolbook" w:hAnsi="Century Schoolbook"/>
+              </w:rPr>
+              <w:t>=5089</w:t>
             </w:r>
           </w:p>
         </w:tc>
@@ -3023,6 +3076,12 @@
               </w:rPr>
               <w:t>0.05</w:t>
             </w:r>
+            <w:r>
+              <w:rPr>
+                <w:rFonts w:ascii="Century Schoolbook" w:hAnsi="Century Schoolbook"/>
+              </w:rPr>
+              <w:t>=1491</w:t>
+            </w:r>
           </w:p>
         </w:tc>
         <w:tc>
@@ -3052,6 +3111,66 @@
       <w:r>
         <w:rPr>
           <w:rFonts w:ascii="Century Schoolbook" w:hAnsi="Century Schoolbook"/>
+        </w:rPr>
+        <w:t xml:space="preserve">1, </w:t>
+      </w:r>
+      <w:r>
+        <w:rPr>
+          <w:rFonts w:ascii="Century Schoolbook" w:hAnsi="Century Schoolbook"/>
+        </w:rPr>
+        <w:t xml:space="preserve">As the threshold increases from 0.0 to 0.05, the vocabulary size drops  from 35,482 down to 1,491 terms because stricter variance cutoffs filter out most low-frequency words. </w:t>
+      </w:r>
+    </w:p>
+    <w:p>
+      <w:pPr>
+        <w:jc w:val="both"/>
+        <w:rPr>
+          <w:rFonts w:ascii="Century Schoolbook" w:hAnsi="Century Schoolbook"/>
+        </w:rPr>
+      </w:pPr>
+      <w:r>
+        <w:rPr>
+          <w:rFonts w:ascii="Century Schoolbook" w:hAnsi="Century Schoolbook"/>
+        </w:rPr>
+        <w:t xml:space="preserve">2, </w:t>
+      </w:r>
+      <w:r>
+        <w:rPr>
+          <w:rFonts w:ascii="Century Schoolbook" w:hAnsi="Century Schoolbook"/>
+        </w:rPr>
+        <w:t>The words eliminated first are primarily extremely rare words that appear only once or twice across the dataset, giving them an almost constant zero count across document</w:t>
+      </w:r>
+    </w:p>
+    <w:p>
+      <w:pPr>
+        <w:jc w:val="both"/>
+        <w:rPr>
+          <w:rFonts w:ascii="Century Schoolbook" w:hAnsi="Century Schoolbook"/>
+        </w:rPr>
+      </w:pPr>
+      <w:r>
+        <w:rPr>
+          <w:rFonts w:ascii="Century Schoolbook" w:hAnsi="Century Schoolbook"/>
+        </w:rPr>
+        <w:t xml:space="preserve">3, </w:t>
+      </w:r>
+      <w:r>
+        <w:rPr>
+          <w:rFonts w:ascii="Century Schoolbook" w:hAnsi="Century Schoolbook"/>
+        </w:rPr>
+        <w:t>Dropping near-zero variance features is safe because words that show almost no variation carry little to no discriminative information between categories, so removing them cuts noise without hurting model accuracy.</w:t>
+      </w:r>
+    </w:p>
+    <w:p>
+      <w:pPr>
+        <w:jc w:val="both"/>
+        <w:rPr>
+          <w:rFonts w:ascii="Century Schoolbook" w:hAnsi="Century Schoolbook"/>
+        </w:rPr>
+      </w:pPr>
+      <w:r>
+        <w:rPr>
+          <w:rFonts w:ascii="Century Schoolbook" w:hAnsi="Century Schoolbook"/>
           <w:b/>
           <w:bCs/>
         </w:rPr>
@@ -3061,7 +3180,7 @@
         <w:rPr>
           <w:rFonts w:ascii="Century Schoolbook" w:hAnsi="Century Schoolbook"/>
         </w:rPr>
-        <w:t xml:space="preserve"> Yes / No </w:t>
+        <w:t xml:space="preserve"> Yes  </w:t>
       </w:r>
     </w:p>
     <w:p>
@@ -3085,6 +3204,24 @@
         </w:rPr>
         <w:t xml:space="preserve"> </w:t>
       </w:r>
+      <w:r>
+        <w:rPr>
+          <w:rFonts w:ascii="Century Schoolbook" w:hAnsi="Century Schoolbook"/>
+        </w:rPr>
+        <w:t>phrasing polish</w:t>
+      </w:r>
+      <w:r>
+        <w:rPr>
+          <w:rFonts w:ascii="Century Schoolbook" w:hAnsi="Century Schoolbook"/>
+        </w:rPr>
+        <w:t xml:space="preserve">, </w:t>
+      </w:r>
+      <w:r>
+        <w:rPr>
+          <w:rFonts w:ascii="Century Schoolbook" w:hAnsi="Century Schoolbook"/>
+        </w:rPr>
+        <w:t>Concept explanation</w:t>
+      </w:r>
     </w:p>
     <w:p>
       <w:pPr>
@@ -3107,125 +3244,31 @@
         </w:rPr>
         <w:t xml:space="preserve"> </w:t>
       </w:r>
-    </w:p>
-    <w:p>
-      <w:pPr>
-        <w:jc w:val="both"/>
-        <w:rPr>
-          <w:rFonts w:ascii="Century Schoolbook" w:hAnsi="Century Schoolbook"/>
-        </w:rPr>
-      </w:pPr>
-    </w:p>
-    <w:p>
-      <w:pPr>
-        <w:jc w:val="both"/>
-        <w:rPr>
-          <w:rFonts w:ascii="Century Schoolbook" w:hAnsi="Century Schoolbook"/>
-        </w:rPr>
-      </w:pPr>
-    </w:p>
-    <w:p>
-      <w:pPr>
-        <w:jc w:val="both"/>
-        <w:rPr>
-          <w:rFonts w:ascii="Century Schoolbook" w:hAnsi="Century Schoolbook"/>
-        </w:rPr>
-      </w:pPr>
-    </w:p>
-    <w:p>
-      <w:pPr>
-        <w:jc w:val="both"/>
-        <w:rPr>
-          <w:rFonts w:ascii="Century Schoolbook" w:hAnsi="Century Schoolbook"/>
-        </w:rPr>
-      </w:pPr>
-    </w:p>
-    <w:p>
-      <w:pPr>
-        <w:jc w:val="both"/>
-        <w:rPr>
-          <w:rFonts w:ascii="Century Schoolbook" w:hAnsi="Century Schoolbook"/>
-        </w:rPr>
-      </w:pPr>
-    </w:p>
-    <w:p>
-      <w:pPr>
-        <w:jc w:val="both"/>
-        <w:rPr>
-          <w:rFonts w:ascii="Century Schoolbook" w:hAnsi="Century Schoolbook"/>
-        </w:rPr>
-      </w:pPr>
-    </w:p>
-    <w:p>
-      <w:pPr>
-        <w:jc w:val="both"/>
-        <w:rPr>
-          <w:rFonts w:ascii="Century Schoolbook" w:hAnsi="Century Schoolbook"/>
-        </w:rPr>
-      </w:pPr>
-    </w:p>
-    <w:p>
-      <w:pPr>
-        <w:jc w:val="both"/>
-        <w:rPr>
-          <w:rFonts w:ascii="Century Schoolbook" w:hAnsi="Century Schoolbook"/>
-        </w:rPr>
-      </w:pPr>
-    </w:p>
-    <w:p>
-      <w:pPr>
-        <w:jc w:val="both"/>
-        <w:rPr>
-          <w:rFonts w:ascii="Century Schoolbook" w:hAnsi="Century Schoolbook"/>
-        </w:rPr>
-      </w:pPr>
-    </w:p>
-    <w:p>
-      <w:pPr>
-        <w:jc w:val="both"/>
-        <w:rPr>
-          <w:rFonts w:ascii="Century Schoolbook" w:hAnsi="Century Schoolbook"/>
-        </w:rPr>
-      </w:pPr>
-    </w:p>
-    <w:p>
-      <w:pPr>
-        <w:jc w:val="both"/>
-        <w:rPr>
-          <w:rFonts w:ascii="Century Schoolbook" w:hAnsi="Century Schoolbook"/>
-        </w:rPr>
-      </w:pPr>
-    </w:p>
-    <w:p>
-      <w:pPr>
-        <w:jc w:val="both"/>
-        <w:rPr>
-          <w:rFonts w:ascii="Century Schoolbook" w:hAnsi="Century Schoolbook"/>
-        </w:rPr>
-      </w:pPr>
-    </w:p>
-    <w:p>
-      <w:pPr>
-        <w:jc w:val="both"/>
-        <w:rPr>
-          <w:rFonts w:ascii="Century Schoolbook" w:hAnsi="Century Schoolbook"/>
-        </w:rPr>
-      </w:pPr>
-    </w:p>
-    <w:p>
-      <w:pPr>
-        <w:jc w:val="both"/>
-        <w:rPr>
-          <w:rFonts w:ascii="Century Schoolbook" w:hAnsi="Century Schoolbook"/>
-        </w:rPr>
-      </w:pPr>
-      <w:r>
-        <w:rPr>
-          <w:rFonts w:ascii="Century Schoolbook" w:hAnsi="Century Schoolbook"/>
-        </w:rPr>
-        <w:lastRenderedPageBreak/>
-        <w:pict w14:anchorId="3BE467AD">
-          <v:rect id="_x0000_i1032" style="width:0;height:1.5pt" o:hralign="center" o:hrstd="t" o:hr="t" fillcolor="#a0a0a0" stroked="f"/>
+      <w:r>
+        <w:rPr>
+          <w:rFonts w:ascii="Century Schoolbook" w:hAnsi="Century Schoolbook"/>
+        </w:rPr>
+        <w:t>https://en.wikipedia.org/wiki/Feature_selection</w:t>
+      </w:r>
+    </w:p>
+    <w:p>
+      <w:pPr>
+        <w:jc w:val="both"/>
+        <w:rPr>
+          <w:rFonts w:ascii="Century Schoolbook" w:hAnsi="Century Schoolbook"/>
+        </w:rPr>
+      </w:pPr>
+      <w:r>
+        <w:rPr>
+          <w:noProof/>
+        </w:rPr>
+      </w:r>
+      <w:r>
+        <w:pict w14:anchorId="126D985F">
+          <v:rect id="Horizontal Line 8" o:spid="_x0000_s2055" style="width:451.3pt;height:1.1pt;visibility:visible;mso-wrap-style:square;mso-left-percent:-10001;mso-top-percent:-10001;mso-position-horizontal:absolute;mso-position-horizontal-relative:char;mso-position-vertical:absolute;mso-position-vertical-relative:line;mso-left-percent:-10001;mso-top-percent:-10001;v-text-anchor:top" o:gfxdata="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" filled="f">
+            <o:lock v:ext="edit" rotation="t" aspectratio="t" verticies="t" text="t" shapetype="t"/>
+            <w10:anchorlock/>
+          </v:rect>
         </w:pict>
       </w:r>
     </w:p>
@@ -3304,8 +3347,6 @@
         </w:rPr>
         <w:t xml:space="preserve">Run the correlation filter against the binary indicator for the </w:t>
       </w:r>
-      <w:proofErr w:type="spellStart"/>
-      <w:proofErr w:type="gramStart"/>
       <w:r>
         <w:rPr>
           <w:rFonts w:ascii="Century Schoolbook" w:hAnsi="Century Schoolbook"/>
@@ -3314,15 +3355,12 @@
         </w:rPr>
         <w:t>comp.graphics</w:t>
       </w:r>
-      <w:proofErr w:type="spellEnd"/>
-      <w:proofErr w:type="gramEnd"/>
       <w:r>
         <w:rPr>
           <w:rFonts w:ascii="Century Schoolbook" w:hAnsi="Century Schoolbook"/>
         </w:rPr>
         <w:t xml:space="preserve"> class. Inspect the top 10 features sorted by </w:t>
       </w:r>
-      <w:proofErr w:type="spellStart"/>
       <w:r>
         <w:rPr>
           <w:rFonts w:ascii="Century Schoolbook" w:hAnsi="Century Schoolbook"/>
@@ -3331,14 +3369,12 @@
         </w:rPr>
         <w:t>pearson_r</w:t>
       </w:r>
-      <w:proofErr w:type="spellEnd"/>
       <w:r>
         <w:rPr>
           <w:rFonts w:ascii="Century Schoolbook" w:hAnsi="Century Schoolbook"/>
         </w:rPr>
         <w:t xml:space="preserve"> and compare them to the top 10 features sorted by </w:t>
       </w:r>
-      <w:proofErr w:type="spellStart"/>
       <w:r>
         <w:rPr>
           <w:rFonts w:ascii="Century Schoolbook" w:hAnsi="Century Schoolbook"/>
@@ -3347,7 +3383,6 @@
         </w:rPr>
         <w:t>spearman_r</w:t>
       </w:r>
-      <w:proofErr w:type="spellEnd"/>
       <w:r>
         <w:rPr>
           <w:rFonts w:ascii="Century Schoolbook" w:hAnsi="Century Schoolbook"/>
@@ -3359,7 +3394,7 @@
       <w:pPr>
         <w:jc w:val="both"/>
         <w:rPr>
-          <w:rFonts w:ascii="Century Schoolbook" w:hAnsi="Century Schoolbook"/>
+          <w:rFonts w:ascii="Century Schoolbook" w:hAnsi="Century Schoolbook" w:hint="eastAsia"/>
         </w:rPr>
       </w:pPr>
       <w:r>
@@ -3373,7 +3408,7 @@
     </w:p>
     <w:p>
       <w:pPr>
-        <w:pStyle w:val="ListParagraph"/>
+        <w:pStyle w:val="a9"/>
         <w:numPr>
           <w:ilvl w:val="1"/>
           <w:numId w:val="7"/>
@@ -3392,7 +3427,7 @@
     </w:p>
     <w:p>
       <w:pPr>
-        <w:pStyle w:val="ListParagraph"/>
+        <w:pStyle w:val="a9"/>
         <w:numPr>
           <w:ilvl w:val="1"/>
           <w:numId w:val="7"/>
@@ -3406,6 +3441,7 @@
         <w:rPr>
           <w:rFonts w:ascii="Century Schoolbook" w:hAnsi="Century Schoolbook"/>
         </w:rPr>
+        <w:lastRenderedPageBreak/>
         <w:t xml:space="preserve">What is the mathematical difference in what </w:t>
       </w:r>
       <w:r>
@@ -3439,7 +3475,7 @@
     </w:p>
     <w:p>
       <w:pPr>
-        <w:pStyle w:val="ListParagraph"/>
+        <w:pStyle w:val="a9"/>
         <w:numPr>
           <w:ilvl w:val="1"/>
           <w:numId w:val="7"/>
@@ -3489,6 +3525,8 @@
         <w:jc w:val="both"/>
         <w:rPr>
           <w:rFonts w:ascii="Century Schoolbook" w:hAnsi="Century Schoolbook"/>
+          <w:b/>
+          <w:bCs/>
         </w:rPr>
       </w:pPr>
       <w:r>
@@ -3510,6 +3548,84 @@
       <w:r>
         <w:rPr>
           <w:rFonts w:ascii="Century Schoolbook" w:hAnsi="Century Schoolbook"/>
+        </w:rPr>
+        <w:t xml:space="preserve">1, </w:t>
+      </w:r>
+      <w:r>
+        <w:rPr>
+          <w:rFonts w:ascii="Century Schoolbook" w:hAnsi="Century Schoolbook" w:hint="eastAsia"/>
+        </w:rPr>
+        <w:t>T</w:t>
+      </w:r>
+      <w:r>
+        <w:rPr>
+          <w:rFonts w:ascii="Century Schoolbook" w:hAnsi="Century Schoolbook"/>
+        </w:rPr>
+        <w:t>he top-correlated words are mostly domain-specific terminology for graphics  rather than generic stop</w:t>
+      </w:r>
+      <w:r>
+        <w:rPr>
+          <w:rFonts w:ascii="Century Schoolbook" w:hAnsi="Century Schoolbook"/>
+        </w:rPr>
+        <w:t xml:space="preserve"> </w:t>
+      </w:r>
+      <w:r>
+        <w:rPr>
+          <w:rFonts w:ascii="Century Schoolbook" w:hAnsi="Century Schoolbook"/>
+        </w:rPr>
+        <w:t xml:space="preserve">words. </w:t>
+      </w:r>
+    </w:p>
+    <w:p>
+      <w:pPr>
+        <w:jc w:val="both"/>
+        <w:rPr>
+          <w:rFonts w:ascii="Century Schoolbook" w:hAnsi="Century Schoolbook"/>
+        </w:rPr>
+      </w:pPr>
+      <w:r>
+        <w:rPr>
+          <w:rFonts w:ascii="Century Schoolbook" w:hAnsi="Century Schoolbook"/>
+        </w:rPr>
+        <w:t xml:space="preserve">2, </w:t>
+      </w:r>
+      <w:r>
+        <w:rPr>
+          <w:rFonts w:ascii="Century Schoolbook" w:hAnsi="Century Schoolbook"/>
+        </w:rPr>
+        <w:t>Pearson measures linear relationships between raw counts, while Spearman measures monotonic relationships based on ranked values.</w:t>
+      </w:r>
+    </w:p>
+    <w:p>
+      <w:pPr>
+        <w:jc w:val="both"/>
+        <w:rPr>
+          <w:rFonts w:ascii="Century Schoolbook" w:hAnsi="Century Schoolbook"/>
+        </w:rPr>
+      </w:pPr>
+      <w:r>
+        <w:rPr>
+          <w:rFonts w:ascii="Century Schoolbook" w:hAnsi="Century Schoolbook"/>
+        </w:rPr>
+        <w:t>3, It</w:t>
+      </w:r>
+      <w:r>
+        <w:rPr>
+          <w:rFonts w:ascii="Century Schoolbook" w:hAnsi="Century Schoolbook"/>
+        </w:rPr>
+        <w:t xml:space="preserve"> happens when a word reliably signals the topic but has skewed counts or extreme outliers in a few texts, which messes up Pearson's linear fit while Spearman's rank order stays solid.</w:t>
+      </w:r>
+    </w:p>
+    <w:p>
+      <w:pPr>
+        <w:jc w:val="both"/>
+        <w:rPr>
+          <w:rFonts w:ascii="Century Schoolbook" w:hAnsi="Century Schoolbook"/>
+        </w:rPr>
+      </w:pPr>
+      <w:r>
+        <w:rPr>
+          <w:rFonts w:ascii="Century Schoolbook" w:hAnsi="Century Schoolbook"/>
           <w:b/>
           <w:bCs/>
         </w:rPr>
@@ -3519,7 +3635,7 @@
         <w:rPr>
           <w:rFonts w:ascii="Century Schoolbook" w:hAnsi="Century Schoolbook"/>
         </w:rPr>
-        <w:t xml:space="preserve"> Yes / No </w:t>
+        <w:t xml:space="preserve"> Yes </w:t>
       </w:r>
     </w:p>
     <w:p>
@@ -3543,12 +3659,29 @@
         </w:rPr>
         <w:t xml:space="preserve"> </w:t>
       </w:r>
-    </w:p>
-    <w:p>
-      <w:pPr>
-        <w:jc w:val="both"/>
-        <w:rPr>
-          <w:rFonts w:ascii="Century Schoolbook" w:hAnsi="Century Schoolbook"/>
+      <w:r>
+        <w:rPr>
+          <w:rFonts w:ascii="Century Schoolbook" w:hAnsi="Century Schoolbook"/>
+        </w:rPr>
+        <w:t>grammar polishing</w:t>
+      </w:r>
+      <w:r>
+        <w:rPr>
+          <w:rFonts w:ascii="Century Schoolbook" w:hAnsi="Century Schoolbook"/>
+        </w:rPr>
+        <w:t xml:space="preserve">, </w:t>
+      </w:r>
+      <w:r>
+        <w:rPr>
+          <w:rFonts w:ascii="Century Schoolbook" w:hAnsi="Century Schoolbook"/>
+        </w:rPr>
+        <w:t>statistical concept explanation</w:t>
+      </w:r>
+    </w:p>
+    <w:p>
+      <w:pPr>
+        <w:rPr>
+          <w:rFonts w:ascii="Century Schoolbook" w:hAnsi="Century Schoolbook" w:hint="eastAsia"/>
         </w:rPr>
       </w:pPr>
       <w:r>
@@ -3565,20 +3698,34 @@
         </w:rPr>
         <w:t xml:space="preserve"> </w:t>
       </w:r>
-    </w:p>
-    <w:p>
-      <w:pPr>
-        <w:jc w:val="both"/>
-        <w:rPr>
-          <w:rFonts w:ascii="Century Schoolbook" w:hAnsi="Century Schoolbook"/>
-        </w:rPr>
-      </w:pPr>
-      <w:r>
-        <w:rPr>
-          <w:rFonts w:ascii="Century Schoolbook" w:hAnsi="Century Schoolbook"/>
-        </w:rPr>
-        <w:pict w14:anchorId="446A19DC">
-          <v:rect id="_x0000_i1033" style="width:0;height:1.5pt" o:hralign="center" o:hrstd="t" o:hr="t" fillcolor="#a0a0a0" stroked="f"/>
+      <w:hyperlink r:id="rId10" w:history="1">
+        <w:r>
+          <w:rPr>
+            <w:rStyle w:val="af2"/>
+            <w:rFonts w:ascii="Century Schoolbook" w:hAnsi="Century Schoolbook"/>
+          </w:rPr>
+          <w:t>https://www.researchgate.net/publication/337559994_A_Measure_of_Similarity_in_Textual_Data_Using_Spearman%27s_Rank_Correlation_Coefficient</w:t>
+        </w:r>
+      </w:hyperlink>
+    </w:p>
+    <w:p>
+      <w:pPr>
+        <w:jc w:val="both"/>
+        <w:rPr>
+          <w:rFonts w:ascii="Century Schoolbook" w:hAnsi="Century Schoolbook"/>
+        </w:rPr>
+      </w:pPr>
+      <w:r>
+        <w:rPr>
+          <w:noProof/>
+        </w:rPr>
+      </w:r>
+      <w:r>
+        <w:pict w14:anchorId="0B88FBC7">
+          <v:rect id="Horizontal Line 9" o:spid="_x0000_s2054" style="width:451.3pt;height:1.1pt;visibility:visible;mso-wrap-style:square;mso-left-percent:-10001;mso-top-percent:-10001;mso-position-horizontal:absolute;mso-position-horizontal-relative:char;mso-position-vertical:absolute;mso-position-vertical-relative:line;mso-left-percent:-10001;mso-top-percent:-10001;v-text-anchor:top" o:gfxdata="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" filled="f">
+            <o:lock v:ext="edit" rotation="t" aspectratio="t" verticies="t" text="t" shapetype="t"/>
+            <w10:anchorlock/>
+          </v:rect>
         </w:pict>
       </w:r>
     </w:p>
@@ -3657,23 +3804,13 @@
         </w:rPr>
         <w:t xml:space="preserve">In the Frequent Pattern Mining section, run </w:t>
       </w:r>
-      <w:proofErr w:type="gramStart"/>
-      <w:r>
-        <w:rPr>
-          <w:rFonts w:ascii="Century Schoolbook" w:hAnsi="Century Schoolbook"/>
-          <w:b/>
-          <w:bCs/>
-        </w:rPr>
-        <w:t>Top-K</w:t>
-      </w:r>
-      <w:proofErr w:type="gramEnd"/>
-      <w:r>
-        <w:rPr>
-          <w:rFonts w:ascii="Century Schoolbook" w:hAnsi="Century Schoolbook"/>
-          <w:b/>
-          <w:bCs/>
-        </w:rPr>
-        <w:t xml:space="preserve"> FAE</w:t>
+      <w:r>
+        <w:rPr>
+          <w:rFonts w:ascii="Century Schoolbook" w:hAnsi="Century Schoolbook"/>
+          <w:b/>
+          <w:bCs/>
+        </w:rPr>
+        <w:t>Top-K FAE</w:t>
       </w:r>
       <w:r>
         <w:rPr>
@@ -3695,7 +3832,6 @@
         </w:rPr>
         <w:t xml:space="preserve">. Then, run </w:t>
       </w:r>
-      <w:proofErr w:type="spellStart"/>
       <w:r>
         <w:rPr>
           <w:rFonts w:ascii="Century Schoolbook" w:hAnsi="Century Schoolbook"/>
@@ -3704,48 +3840,19 @@
         </w:rPr>
         <w:t>MaxFPGrowth</w:t>
       </w:r>
-      <w:proofErr w:type="spellEnd"/>
       <w:r>
         <w:rPr>
           <w:rFonts w:ascii="Century Schoolbook" w:hAnsi="Century Schoolbook"/>
         </w:rPr>
         <w:t xml:space="preserve"> using minimum support thresholds </w:t>
       </w:r>
-      <w:proofErr w:type="spellStart"/>
-      <w:r>
-        <w:rPr>
-          <w:rFonts w:ascii="Century Schoolbook" w:hAnsi="Century Schoolbook"/>
-          <w:b/>
-          <w:bCs/>
-        </w:rPr>
-        <w:t>minSup</w:t>
-      </w:r>
-      <w:proofErr w:type="spellEnd"/>
-      <w:r>
-        <w:rPr>
-          <w:rFonts w:ascii="Century Schoolbook" w:hAnsi="Century Schoolbook"/>
-          <w:b/>
-          <w:bCs/>
-        </w:rPr>
-        <w:t xml:space="preserve">=9 and </w:t>
-      </w:r>
-      <w:proofErr w:type="spellStart"/>
-      <w:r>
-        <w:rPr>
-          <w:rFonts w:ascii="Century Schoolbook" w:hAnsi="Century Schoolbook"/>
-          <w:b/>
-          <w:bCs/>
-        </w:rPr>
-        <w:t>minSup</w:t>
-      </w:r>
-      <w:proofErr w:type="spellEnd"/>
-      <w:r>
-        <w:rPr>
-          <w:rFonts w:ascii="Century Schoolbook" w:hAnsi="Century Schoolbook"/>
-          <w:b/>
-          <w:bCs/>
-        </w:rPr>
-        <w:t>= 3</w:t>
+      <w:r>
+        <w:rPr>
+          <w:rFonts w:ascii="Century Schoolbook" w:hAnsi="Century Schoolbook"/>
+          <w:b/>
+          <w:bCs/>
+        </w:rPr>
+        <w:t>minSup=9 and minSup= 3</w:t>
       </w:r>
       <w:r>
         <w:rPr>
@@ -3790,7 +3897,6 @@
         </w:rPr>
         <w:t xml:space="preserve">How does decreasing </w:t>
       </w:r>
-      <w:proofErr w:type="spellStart"/>
       <w:r>
         <w:rPr>
           <w:rFonts w:ascii="Century Schoolbook" w:hAnsi="Century Schoolbook"/>
@@ -3799,14 +3905,12 @@
         </w:rPr>
         <w:t>minSup</w:t>
       </w:r>
-      <w:proofErr w:type="spellEnd"/>
       <w:r>
         <w:rPr>
           <w:rFonts w:ascii="Century Schoolbook" w:hAnsi="Century Schoolbook"/>
         </w:rPr>
         <w:t xml:space="preserve"> (from 9 to 3) in </w:t>
       </w:r>
-      <w:proofErr w:type="spellStart"/>
       <w:r>
         <w:rPr>
           <w:rFonts w:ascii="Century Schoolbook" w:hAnsi="Century Schoolbook"/>
@@ -3815,7 +3919,6 @@
         </w:rPr>
         <w:t>MaxFPGrowth</w:t>
       </w:r>
-      <w:proofErr w:type="spellEnd"/>
       <w:r>
         <w:rPr>
           <w:rFonts w:ascii="Century Schoolbook" w:hAnsi="Century Schoolbook"/>
@@ -3841,23 +3944,13 @@
         </w:rPr>
         <w:t xml:space="preserve">How does the parameter k in </w:t>
       </w:r>
-      <w:proofErr w:type="gramStart"/>
-      <w:r>
-        <w:rPr>
-          <w:rFonts w:ascii="Century Schoolbook" w:hAnsi="Century Schoolbook"/>
-          <w:b/>
-          <w:bCs/>
-        </w:rPr>
-        <w:t>Top-K</w:t>
-      </w:r>
-      <w:proofErr w:type="gramEnd"/>
-      <w:r>
-        <w:rPr>
-          <w:rFonts w:ascii="Century Schoolbook" w:hAnsi="Century Schoolbook"/>
-          <w:b/>
-          <w:bCs/>
-        </w:rPr>
-        <w:t xml:space="preserve"> FAE</w:t>
+      <w:r>
+        <w:rPr>
+          <w:rFonts w:ascii="Century Schoolbook" w:hAnsi="Century Schoolbook"/>
+          <w:b/>
+          <w:bCs/>
+        </w:rPr>
+        <w:t>Top-K FAE</w:t>
       </w:r>
       <w:r>
         <w:rPr>
@@ -3865,7 +3958,6 @@
         </w:rPr>
         <w:t xml:space="preserve"> differ fundamentally from </w:t>
       </w:r>
-      <w:proofErr w:type="spellStart"/>
       <w:r>
         <w:rPr>
           <w:rFonts w:ascii="Century Schoolbook" w:hAnsi="Century Schoolbook"/>
@@ -3874,14 +3966,12 @@
         </w:rPr>
         <w:t>minSup</w:t>
       </w:r>
-      <w:proofErr w:type="spellEnd"/>
       <w:r>
         <w:rPr>
           <w:rFonts w:ascii="Century Schoolbook" w:hAnsi="Century Schoolbook"/>
         </w:rPr>
         <w:t xml:space="preserve"> in </w:t>
       </w:r>
-      <w:proofErr w:type="spellStart"/>
       <w:r>
         <w:rPr>
           <w:rFonts w:ascii="Century Schoolbook" w:hAnsi="Century Schoolbook"/>
@@ -3890,7 +3980,6 @@
         </w:rPr>
         <w:t>MaxFPGrowth</w:t>
       </w:r>
-      <w:proofErr w:type="spellEnd"/>
       <w:r>
         <w:rPr>
           <w:rFonts w:ascii="Century Schoolbook" w:hAnsi="Century Schoolbook"/>
@@ -3922,155 +4011,184 @@
         <w:jc w:val="both"/>
         <w:rPr>
           <w:rFonts w:ascii="Century Schoolbook" w:hAnsi="Century Schoolbook"/>
-        </w:rPr>
-      </w:pPr>
-      <w:r>
-        <w:rPr>
-          <w:rFonts w:ascii="Century Schoolbook" w:hAnsi="Century Schoolbook"/>
-          <w:b/>
-          <w:bCs/>
-        </w:rPr>
-        <w:t>Answer (</w:t>
-      </w:r>
-      <w:proofErr w:type="gramStart"/>
-      <w:r>
-        <w:rPr>
-          <w:rFonts w:ascii="Century Schoolbook" w:hAnsi="Century Schoolbook"/>
-          <w:b/>
-          <w:bCs/>
-        </w:rPr>
-        <w:t>1) —</w:t>
-      </w:r>
-      <w:proofErr w:type="gramEnd"/>
-      <w:r>
-        <w:rPr>
-          <w:rFonts w:ascii="Century Schoolbook" w:hAnsi="Century Schoolbook"/>
-          <w:b/>
-          <w:bCs/>
-        </w:rPr>
-        <w:t xml:space="preserve"> Runtime and pattern count when lowering </w:t>
-      </w:r>
-      <w:proofErr w:type="spellStart"/>
-      <w:r>
-        <w:rPr>
-          <w:rFonts w:ascii="Century Schoolbook" w:hAnsi="Century Schoolbook"/>
-          <w:b/>
-          <w:bCs/>
-        </w:rPr>
-        <w:t>minSup</w:t>
-      </w:r>
-      <w:proofErr w:type="spellEnd"/>
-      <w:r>
-        <w:rPr>
-          <w:rFonts w:ascii="Century Schoolbook" w:hAnsi="Century Schoolbook"/>
-          <w:b/>
-          <w:bCs/>
-        </w:rPr>
-        <w:t>:</w:t>
-      </w:r>
-    </w:p>
-    <w:p>
-      <w:pPr>
-        <w:jc w:val="both"/>
-        <w:rPr>
-          <w:rFonts w:ascii="Century Schoolbook" w:hAnsi="Century Schoolbook"/>
-        </w:rPr>
-      </w:pPr>
-      <w:r>
-        <w:rPr>
-          <w:rFonts w:ascii="Century Schoolbook" w:hAnsi="Century Schoolbook"/>
-          <w:b/>
-          <w:bCs/>
-        </w:rPr>
-        <w:t>Answer (</w:t>
-      </w:r>
-      <w:proofErr w:type="gramStart"/>
-      <w:r>
-        <w:rPr>
-          <w:rFonts w:ascii="Century Schoolbook" w:hAnsi="Century Schoolbook"/>
-          <w:b/>
-          <w:bCs/>
-        </w:rPr>
-        <w:t>2) —</w:t>
-      </w:r>
-      <w:proofErr w:type="gramEnd"/>
-      <w:r>
-        <w:rPr>
-          <w:rFonts w:ascii="Century Schoolbook" w:hAnsi="Century Schoolbook"/>
-          <w:b/>
-          <w:bCs/>
-        </w:rPr>
-        <w:t xml:space="preserve"> Top-K k vs </w:t>
-      </w:r>
-      <w:proofErr w:type="spellStart"/>
-      <w:r>
-        <w:rPr>
-          <w:rFonts w:ascii="Century Schoolbook" w:hAnsi="Century Schoolbook"/>
-          <w:b/>
-          <w:bCs/>
-        </w:rPr>
-        <w:t>MaxFPGrowth</w:t>
-      </w:r>
-      <w:proofErr w:type="spellEnd"/>
-      <w:r>
-        <w:rPr>
-          <w:rFonts w:ascii="Century Schoolbook" w:hAnsi="Century Schoolbook"/>
-          <w:b/>
-          <w:bCs/>
+          <w:b/>
+          <w:bCs/>
+        </w:rPr>
+      </w:pPr>
+      <w:r>
+        <w:rPr>
+          <w:rFonts w:ascii="Century Schoolbook" w:hAnsi="Century Schoolbook"/>
+          <w:b/>
+          <w:bCs/>
+        </w:rPr>
+        <w:t>Answer (1) — Runtime and pattern count when lowering minSup:</w:t>
+      </w:r>
+    </w:p>
+    <w:p>
+      <w:pPr>
+        <w:jc w:val="both"/>
+        <w:rPr>
+          <w:rFonts w:ascii="Century Schoolbook" w:hAnsi="Century Schoolbook"/>
+        </w:rPr>
+      </w:pPr>
+      <w:r>
+        <w:rPr>
+          <w:rFonts w:ascii="Century Schoolbook" w:hAnsi="Century Schoolbook"/>
+        </w:rPr>
+        <w:t>Decreasing minSup from 9 to 3 increase the number of discovered patterns from 710 up to 9,547 because a much wider set of</w:t>
+      </w:r>
+      <w:r>
+        <w:rPr>
+          <w:rFonts w:ascii="Century Schoolbook" w:hAnsi="Century Schoolbook"/>
         </w:rPr>
         <w:t xml:space="preserve"> </w:t>
       </w:r>
-      <w:proofErr w:type="spellStart"/>
-      <w:r>
-        <w:rPr>
-          <w:rFonts w:ascii="Century Schoolbook" w:hAnsi="Century Schoolbook"/>
-          <w:b/>
-          <w:bCs/>
-        </w:rPr>
-        <w:t>minSup</w:t>
-      </w:r>
-      <w:proofErr w:type="spellEnd"/>
-      <w:r>
-        <w:rPr>
-          <w:rFonts w:ascii="Century Schoolbook" w:hAnsi="Century Schoolbook"/>
-          <w:b/>
-          <w:bCs/>
-        </w:rPr>
-        <w:t>:</w:t>
-      </w:r>
-    </w:p>
-    <w:p>
-      <w:pPr>
-        <w:jc w:val="both"/>
-        <w:rPr>
-          <w:rFonts w:ascii="Century Schoolbook" w:hAnsi="Century Schoolbook"/>
-        </w:rPr>
-      </w:pPr>
-      <w:r>
-        <w:rPr>
-          <w:rFonts w:ascii="Century Schoolbook" w:hAnsi="Century Schoolbook"/>
-          <w:b/>
-          <w:bCs/>
-        </w:rPr>
-        <w:t>Answer (</w:t>
-      </w:r>
-      <w:proofErr w:type="gramStart"/>
-      <w:r>
-        <w:rPr>
-          <w:rFonts w:ascii="Century Schoolbook" w:hAnsi="Century Schoolbook"/>
-          <w:b/>
-          <w:bCs/>
-        </w:rPr>
-        <w:t>3) —</w:t>
-      </w:r>
-      <w:proofErr w:type="gramEnd"/>
-      <w:r>
-        <w:rPr>
-          <w:rFonts w:ascii="Century Schoolbook" w:hAnsi="Century Schoolbook"/>
-          <w:b/>
-          <w:bCs/>
-        </w:rPr>
-        <w:t xml:space="preserve"> Maximal vs standard frequent patterns:</w:t>
+      <w:r>
+        <w:rPr>
+          <w:rFonts w:ascii="Century Schoolbook" w:hAnsi="Century Schoolbook" w:hint="eastAsia"/>
+        </w:rPr>
+        <w:t xml:space="preserve"> </w:t>
+      </w:r>
+      <w:r>
+        <w:rPr>
+          <w:rFonts w:ascii="Century Schoolbook" w:hAnsi="Century Schoolbook"/>
+        </w:rPr>
+        <w:t>lower-frequency itemset now qualifies. Consequently, the execution runtime increases significantly from around 0.04 seconds to over 0.62 seconds due to the exponential expansion of the FP-tree branches and recursive search space.</w:t>
+      </w:r>
+    </w:p>
+    <w:p>
+      <w:pPr>
+        <w:jc w:val="both"/>
+        <w:rPr>
+          <w:rFonts w:ascii="Century Schoolbook" w:hAnsi="Century Schoolbook"/>
+          <w:b/>
+          <w:bCs/>
+        </w:rPr>
+      </w:pPr>
+      <w:r>
+        <w:rPr>
+          <w:rFonts w:ascii="Century Schoolbook" w:hAnsi="Century Schoolbook"/>
+          <w:b/>
+          <w:bCs/>
+        </w:rPr>
+        <w:t>Answer (2) — Top-K k vs MaxFPGrowth minSup:</w:t>
+      </w:r>
+    </w:p>
+    <w:p>
+      <w:pPr>
+        <w:jc w:val="both"/>
+        <w:rPr>
+          <w:rFonts w:ascii="Century Schoolbook" w:hAnsi="Century Schoolbook"/>
+        </w:rPr>
+      </w:pPr>
+      <w:r>
+        <w:rPr>
+          <w:rFonts w:ascii="Century Schoolbook" w:hAnsi="Century Schoolbook"/>
+        </w:rPr>
+        <w:t xml:space="preserve">The parameter </w:t>
+      </w:r>
+      <m:oMath>
+        <m:r>
+          <w:rPr>
+            <w:rFonts w:ascii="Cambria Math" w:hAnsi="Cambria Math"/>
+          </w:rPr>
+          <m:t>k</m:t>
+        </m:r>
+      </m:oMath>
+      <w:r>
+        <w:rPr>
+          <w:rFonts w:ascii="Century Schoolbook" w:hAnsi="Century Schoolbook"/>
+        </w:rPr>
+        <w:t xml:space="preserve"> in Top-K FAE sets an explicit quota on the total number of desired patterns, raising internal thresholds to return only the </w:t>
+      </w:r>
+      <m:oMath>
+        <m:r>
+          <w:rPr>
+            <w:rFonts w:ascii="Cambria Math" w:hAnsi="Cambria Math"/>
+          </w:rPr>
+          <m:t>k</m:t>
+        </m:r>
+      </m:oMath>
+      <w:r>
+        <w:rPr>
+          <w:rFonts w:ascii="Century Schoolbook" w:hAnsi="Century Schoolbook"/>
+        </w:rPr>
+        <w:t xml:space="preserve"> most frequent one without </w:t>
+      </w:r>
+      <w:r>
+        <w:rPr>
+          <w:rFonts w:ascii="Century Schoolbook" w:hAnsi="Century Schoolbook"/>
+        </w:rPr>
+        <w:lastRenderedPageBreak/>
+        <w:t>needing prior knowledge of the dataset. In contrast, minSup in MaxFPGrowth defines a rigid frequency cutoff where any pattern meeting the absolute support count is retained, meaning the final number of output patterns is variable and unpredictable.</w:t>
+      </w:r>
+    </w:p>
+    <w:p>
+      <w:pPr>
+        <w:jc w:val="both"/>
+        <w:rPr>
+          <w:rFonts w:ascii="Century Schoolbook" w:hAnsi="Century Schoolbook"/>
+          <w:b/>
+          <w:bCs/>
+        </w:rPr>
+      </w:pPr>
+      <w:r>
+        <w:rPr>
+          <w:rFonts w:ascii="Century Schoolbook" w:hAnsi="Century Schoolbook"/>
+          <w:b/>
+          <w:bCs/>
+        </w:rPr>
+        <w:t>Answer (3) — Maximal vs standard frequent patterns:</w:t>
+      </w:r>
+    </w:p>
+    <w:p>
+      <w:pPr>
+        <w:jc w:val="both"/>
+        <w:rPr>
+          <w:rFonts w:ascii="Century Schoolbook" w:hAnsi="Century Schoolbook"/>
+        </w:rPr>
+      </w:pPr>
+      <w:r>
+        <w:rPr>
+          <w:rFonts w:ascii="Century Schoolbook" w:hAnsi="Century Schoolbook"/>
+        </w:rPr>
+        <w:t>Maximal frequent patterns are more concise because they only retain frequent item</w:t>
+      </w:r>
+      <w:r>
+        <w:rPr>
+          <w:rFonts w:ascii="Century Schoolbook" w:hAnsi="Century Schoolbook"/>
+        </w:rPr>
+        <w:t xml:space="preserve"> </w:t>
+      </w:r>
+      <w:r>
+        <w:rPr>
+          <w:rFonts w:ascii="Century Schoolbook" w:hAnsi="Century Schoolbook"/>
+        </w:rPr>
+        <w:t>sets that have no frequent supersets. By omitting all redundant frequent subsets</w:t>
+      </w:r>
+      <w:r>
+        <w:rPr>
+          <w:rFonts w:ascii="Century Schoolbook" w:hAnsi="Century Schoolbook"/>
+        </w:rPr>
+        <w:t xml:space="preserve"> </w:t>
+      </w:r>
+      <w:r>
+        <w:rPr>
+          <w:rFonts w:ascii="Century Schoolbook" w:hAnsi="Century Schoolbook"/>
+        </w:rPr>
+        <w:t>which standard frequent pattern mining exhaustively enumerates</w:t>
+      </w:r>
+      <w:r>
+        <w:rPr>
+          <w:rFonts w:ascii="Century Schoolbook" w:hAnsi="Century Schoolbook"/>
+        </w:rPr>
+        <w:t xml:space="preserve"> </w:t>
+      </w:r>
+      <w:r>
+        <w:rPr>
+          <w:rFonts w:ascii="Century Schoolbook" w:hAnsi="Century Schoolbook"/>
+        </w:rPr>
+        <w:t>maximal patterns provide a compact, loss-free representation of the itemset boundaries.</w:t>
       </w:r>
     </w:p>
     <w:p>
@@ -4092,7 +4210,7 @@
         <w:rPr>
           <w:rFonts w:ascii="Century Schoolbook" w:hAnsi="Century Schoolbook"/>
         </w:rPr>
-        <w:t xml:space="preserve"> Yes / No </w:t>
+        <w:t xml:space="preserve"> Yes </w:t>
       </w:r>
     </w:p>
     <w:p>
@@ -4116,6 +4234,21 @@
         </w:rPr>
         <w:t xml:space="preserve"> </w:t>
       </w:r>
+      <w:r>
+        <w:rPr>
+          <w:rFonts w:ascii="Century Schoolbook" w:hAnsi="Century Schoolbook"/>
+        </w:rPr>
+        <w:t>algorithmic comparison</w:t>
+      </w:r>
+      <w:r>
+        <w:t xml:space="preserve"> </w:t>
+      </w:r>
+      <w:r>
+        <w:rPr>
+          <w:rFonts w:ascii="Century Schoolbook" w:hAnsi="Century Schoolbook"/>
+        </w:rPr>
+        <w:t>and phrasing polish</w:t>
+      </w:r>
     </w:p>
     <w:p>
       <w:pPr>
@@ -4138,20 +4271,34 @@
         </w:rPr>
         <w:t xml:space="preserve"> </w:t>
       </w:r>
-    </w:p>
-    <w:p>
-      <w:pPr>
-        <w:jc w:val="both"/>
-        <w:rPr>
-          <w:rFonts w:ascii="Century Schoolbook" w:hAnsi="Century Schoolbook"/>
-        </w:rPr>
-      </w:pPr>
-      <w:r>
-        <w:rPr>
-          <w:rFonts w:ascii="Century Schoolbook" w:hAnsi="Century Schoolbook"/>
-        </w:rPr>
-        <w:pict w14:anchorId="356EE7BC">
-          <v:rect id="_x0000_i1034" style="width:0;height:1.5pt" o:hralign="center" o:hrstd="t" o:hr="t" fillcolor="#a0a0a0" stroked="f"/>
+      <w:hyperlink r:id="rId11" w:history="1">
+        <w:r>
+          <w:rPr>
+            <w:rStyle w:val="af2"/>
+            <w:rFonts w:ascii="Century Schoolbook" w:hAnsi="Century Schoolbook"/>
+          </w:rPr>
+          <w:t>https://pami-dminer.github.io/PAMI/</w:t>
+        </w:r>
+      </w:hyperlink>
+    </w:p>
+    <w:p>
+      <w:pPr>
+        <w:jc w:val="both"/>
+        <w:rPr>
+          <w:rFonts w:ascii="Century Schoolbook" w:hAnsi="Century Schoolbook"/>
+        </w:rPr>
+      </w:pPr>
+      <w:r>
+        <w:rPr>
+          <w:noProof/>
+        </w:rPr>
+      </w:r>
+      <w:r>
+        <w:pict w14:anchorId="462A0985">
+          <v:rect id="Horizontal Line 10" o:spid="_x0000_s2053" style="width:451.3pt;height:1.1pt;visibility:visible;mso-wrap-style:square;mso-left-percent:-10001;mso-top-percent:-10001;mso-position-horizontal:absolute;mso-position-horizontal-relative:char;mso-position-vertical:absolute;mso-position-vertical-relative:line;mso-left-percent:-10001;mso-top-percent:-10001;v-text-anchor:top" o:gfxdata="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" filled="f">
+            <o:lock v:ext="edit" rotation="t" aspectratio="t" verticies="t" text="t" shapetype="t"/>
+            <w10:anchorlock/>
+          </v:rect>
         </w:pict>
       </w:r>
     </w:p>
@@ -4170,7 +4317,6 @@
           <w:b/>
           <w:bCs/>
         </w:rPr>
-        <w:lastRenderedPageBreak/>
         <w:t>Question 8: Dimensionality Reduction — Motivation</w:t>
       </w:r>
     </w:p>
@@ -4219,7 +4365,6 @@
         </w:rPr>
         <w:t xml:space="preserve">After text vectorization, the </w:t>
       </w:r>
-      <w:proofErr w:type="spellStart"/>
       <w:r>
         <w:rPr>
           <w:rFonts w:ascii="Century Schoolbook" w:hAnsi="Century Schoolbook"/>
@@ -4228,7 +4373,6 @@
         </w:rPr>
         <w:t>X_counts</w:t>
       </w:r>
-      <w:proofErr w:type="spellEnd"/>
       <w:r>
         <w:rPr>
           <w:rFonts w:ascii="Century Schoolbook" w:hAnsi="Century Schoolbook"/>
@@ -4254,7 +4398,7 @@
     </w:p>
     <w:p>
       <w:pPr>
-        <w:pStyle w:val="ListParagraph"/>
+        <w:pStyle w:val="a9"/>
         <w:numPr>
           <w:ilvl w:val="0"/>
           <w:numId w:val="20"/>
@@ -4270,7 +4414,6 @@
         </w:rPr>
         <w:t xml:space="preserve">If we want to visually map how these documents group by category on a scatter plot, why is it mathematically and visually impossible to plot the raw </w:t>
       </w:r>
-      <w:proofErr w:type="spellStart"/>
       <w:r>
         <w:rPr>
           <w:rFonts w:ascii="Century Schoolbook" w:hAnsi="Century Schoolbook"/>
@@ -4279,7 +4422,6 @@
         </w:rPr>
         <w:t>X_counts</w:t>
       </w:r>
-      <w:proofErr w:type="spellEnd"/>
       <w:r>
         <w:rPr>
           <w:rFonts w:ascii="Century Schoolbook" w:hAnsi="Century Schoolbook"/>
@@ -4289,7 +4431,7 @@
     </w:p>
     <w:p>
       <w:pPr>
-        <w:pStyle w:val="ListParagraph"/>
+        <w:pStyle w:val="a9"/>
         <w:numPr>
           <w:ilvl w:val="0"/>
           <w:numId w:val="20"/>
@@ -4311,6 +4453,8 @@
         <w:jc w:val="both"/>
         <w:rPr>
           <w:rFonts w:ascii="Century Schoolbook" w:hAnsi="Century Schoolbook"/>
+          <w:b/>
+          <w:bCs/>
         </w:rPr>
       </w:pPr>
       <w:r>
@@ -4332,6 +4476,52 @@
       <w:r>
         <w:rPr>
           <w:rFonts w:ascii="Century Schoolbook" w:hAnsi="Century Schoolbook"/>
+        </w:rPr>
+        <w:t xml:space="preserve">1, </w:t>
+      </w:r>
+      <w:r>
+        <w:rPr>
+          <w:rFonts w:ascii="Century Schoolbook" w:hAnsi="Century Schoolbook" w:hint="eastAsia"/>
+        </w:rPr>
+        <w:t>A</w:t>
+      </w:r>
+      <w:r>
+        <w:rPr>
+          <w:rFonts w:ascii="Century Schoolbook" w:hAnsi="Century Schoolbook"/>
+        </w:rPr>
+        <w:t xml:space="preserve"> scatter plot can only visualize 2D or 3D coordinates, whereas the raw X_counts matrix resides in a space with tens of thousands of features, making direct geometric plotting mathematically impossible. </w:t>
+      </w:r>
+    </w:p>
+    <w:p>
+      <w:pPr>
+        <w:jc w:val="both"/>
+        <w:rPr>
+          <w:rFonts w:ascii="Century Schoolbook" w:hAnsi="Century Schoolbook" w:hint="eastAsia"/>
+        </w:rPr>
+      </w:pPr>
+      <w:r>
+        <w:rPr>
+          <w:rFonts w:ascii="Century Schoolbook" w:hAnsi="Century Schoolbook"/>
+        </w:rPr>
+        <w:t xml:space="preserve">2, </w:t>
+      </w:r>
+      <w:r>
+        <w:rPr>
+          <w:rFonts w:ascii="Century Schoolbook" w:hAnsi="Century Schoolbook"/>
+        </w:rPr>
+        <w:t xml:space="preserve">Dimensionality reduction algorithms must be applied first, specifically techniques such as PCA, t-SNE, or UMAP . </w:t>
+      </w:r>
+    </w:p>
+    <w:p>
+      <w:pPr>
+        <w:jc w:val="both"/>
+        <w:rPr>
+          <w:rFonts w:ascii="Century Schoolbook" w:hAnsi="Century Schoolbook"/>
+        </w:rPr>
+      </w:pPr>
+      <w:r>
+        <w:rPr>
+          <w:rFonts w:ascii="Century Schoolbook" w:hAnsi="Century Schoolbook"/>
           <w:b/>
           <w:bCs/>
         </w:rPr>
@@ -4341,7 +4531,7 @@
         <w:rPr>
           <w:rFonts w:ascii="Century Schoolbook" w:hAnsi="Century Schoolbook"/>
         </w:rPr>
-        <w:t xml:space="preserve"> Yes / No </w:t>
+        <w:t xml:space="preserve"> No</w:t>
       </w:r>
     </w:p>
     <w:p>
@@ -4397,10 +4587,15 @@
       </w:pPr>
       <w:r>
         <w:rPr>
-          <w:rFonts w:ascii="Century Schoolbook" w:hAnsi="Century Schoolbook"/>
-        </w:rPr>
-        <w:pict w14:anchorId="7ABCF6D4">
-          <v:rect id="_x0000_i1035" style="width:0;height:1.5pt" o:hralign="center" o:hrstd="t" o:hr="t" fillcolor="#a0a0a0" stroked="f"/>
+          <w:noProof/>
+        </w:rPr>
+      </w:r>
+      <w:r>
+        <w:pict w14:anchorId="19F5BEFE">
+          <v:rect id="Horizontal Line 11" o:spid="_x0000_s2052" style="width:451.3pt;height:1.1pt;visibility:visible;mso-wrap-style:square;mso-left-percent:-10001;mso-top-percent:-10001;mso-position-horizontal:absolute;mso-position-horizontal-relative:char;mso-position-vertical:absolute;mso-position-vertical-relative:line;mso-left-percent:-10001;mso-top-percent:-10001;v-text-anchor:top" o:gfxdata="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" filled="f">
+            <o:lock v:ext="edit" rotation="t" aspectratio="t" verticies="t" text="t" shapetype="t"/>
+            <w10:anchorlock/>
+          </v:rect>
         </w:pict>
       </w:r>
     </w:p>
@@ -4531,12 +4726,13 @@
           <w:b/>
           <w:bCs/>
         </w:rPr>
+        <w:lastRenderedPageBreak/>
         <w:t>Questions:</w:t>
       </w:r>
     </w:p>
     <w:p>
       <w:pPr>
-        <w:pStyle w:val="ListParagraph"/>
+        <w:pStyle w:val="a9"/>
         <w:numPr>
           <w:ilvl w:val="0"/>
           <w:numId w:val="21"/>
@@ -4569,7 +4765,7 @@
     </w:p>
     <w:p>
       <w:pPr>
-        <w:pStyle w:val="ListParagraph"/>
+        <w:pStyle w:val="a9"/>
         <w:numPr>
           <w:ilvl w:val="0"/>
           <w:numId w:val="21"/>
@@ -4630,7 +4826,7 @@
     </w:p>
     <w:p>
       <w:pPr>
-        <w:pStyle w:val="ListParagraph"/>
+        <w:pStyle w:val="a9"/>
         <w:numPr>
           <w:ilvl w:val="0"/>
           <w:numId w:val="21"/>
@@ -4666,6 +4862,8 @@
         <w:jc w:val="both"/>
         <w:rPr>
           <w:rFonts w:ascii="Century Schoolbook" w:hAnsi="Century Schoolbook"/>
+          <w:b/>
+          <w:bCs/>
         </w:rPr>
       </w:pPr>
       <w:r>
@@ -4687,6 +4885,84 @@
       <w:r>
         <w:rPr>
           <w:rFonts w:ascii="Century Schoolbook" w:hAnsi="Century Schoolbook"/>
+        </w:rPr>
+        <w:t xml:space="preserve">1, </w:t>
+      </w:r>
+      <w:r>
+        <w:rPr>
+          <w:rFonts w:ascii="Century Schoolbook" w:hAnsi="Century Schoolbook" w:hint="eastAsia"/>
+        </w:rPr>
+        <w:t>t</w:t>
+      </w:r>
+      <w:r>
+        <w:rPr>
+          <w:rFonts w:ascii="Century Schoolbook" w:hAnsi="Century Schoolbook"/>
+        </w:rPr>
+        <w:t xml:space="preserve">-SNE and UMAP show distinct, well-separated cluster islands for the 4 document categories, whereas PCA shows heavy overlap around the center where categories </w:t>
+      </w:r>
+      <w:r>
+        <w:rPr>
+          <w:rFonts w:ascii="Century Schoolbook" w:hAnsi="Century Schoolbook"/>
+        </w:rPr>
+        <w:t>blend</w:t>
+      </w:r>
+      <w:r>
+        <w:rPr>
+          <w:rFonts w:ascii="Century Schoolbook" w:hAnsi="Century Schoolbook"/>
+        </w:rPr>
+        <w:t xml:space="preserve">. </w:t>
+      </w:r>
+    </w:p>
+    <w:p>
+      <w:pPr>
+        <w:jc w:val="both"/>
+        <w:rPr>
+          <w:rFonts w:ascii="Century Schoolbook" w:hAnsi="Century Schoolbook"/>
+        </w:rPr>
+      </w:pPr>
+      <w:r>
+        <w:rPr>
+          <w:rFonts w:ascii="Century Schoolbook" w:hAnsi="Century Schoolbook"/>
+        </w:rPr>
+        <w:t xml:space="preserve">2, </w:t>
+      </w:r>
+      <w:r>
+        <w:rPr>
+          <w:rFonts w:ascii="Century Schoolbook" w:hAnsi="Century Schoolbook"/>
+        </w:rPr>
+        <w:t xml:space="preserve">PCA is a linear projection technique that seeks directions maximizing global variance, mak it incapable of capturing the non-linear manifold structures and high-dimensional semantic relationships inherent in sparse text data. In contrast, t-SNE and UMAP optimize for preserving local neighborhood structure. </w:t>
+      </w:r>
+    </w:p>
+    <w:p>
+      <w:pPr>
+        <w:jc w:val="both"/>
+        <w:rPr>
+          <w:rFonts w:ascii="Century Schoolbook" w:hAnsi="Century Schoolbook" w:hint="eastAsia"/>
+        </w:rPr>
+      </w:pPr>
+      <w:r>
+        <w:rPr>
+          <w:rFonts w:ascii="Century Schoolbook" w:hAnsi="Century Schoolbook"/>
+        </w:rPr>
+        <w:t xml:space="preserve">3, </w:t>
+      </w:r>
+      <w:r>
+        <w:rPr>
+          <w:rFonts w:ascii="Century Schoolbook" w:hAnsi="Century Schoolbook"/>
+        </w:rPr>
+        <w:t>t-SNE preserves local similarities rather than global distances. The physical spacing and relative positioning between separate clusters are heavily influenced by arbitrary initialization and hyperparameters, so inter-cluster distances do not reflect true semantic dissimilarity in the original high-dimensional space.</w:t>
+      </w:r>
+    </w:p>
+    <w:p>
+      <w:pPr>
+        <w:jc w:val="both"/>
+        <w:rPr>
+          <w:rFonts w:ascii="Century Schoolbook" w:hAnsi="Century Schoolbook"/>
+        </w:rPr>
+      </w:pPr>
+      <w:r>
+        <w:rPr>
+          <w:rFonts w:ascii="Century Schoolbook" w:hAnsi="Century Schoolbook"/>
           <w:b/>
           <w:bCs/>
         </w:rPr>
@@ -4696,14 +4972,14 @@
         <w:rPr>
           <w:rFonts w:ascii="Century Schoolbook" w:hAnsi="Century Schoolbook"/>
         </w:rPr>
-        <w:t xml:space="preserve"> Yes / No </w:t>
-      </w:r>
-    </w:p>
-    <w:p>
-      <w:pPr>
-        <w:jc w:val="both"/>
-        <w:rPr>
-          <w:rFonts w:ascii="Century Schoolbook" w:hAnsi="Century Schoolbook"/>
+        <w:t xml:space="preserve"> Yes </w:t>
+      </w:r>
+    </w:p>
+    <w:p>
+      <w:pPr>
+        <w:jc w:val="both"/>
+        <w:rPr>
+          <w:rFonts w:ascii="Century Schoolbook" w:hAnsi="Century Schoolbook" w:hint="eastAsia"/>
         </w:rPr>
       </w:pPr>
       <w:r>
@@ -4720,6 +4996,24 @@
         </w:rPr>
         <w:t xml:space="preserve"> </w:t>
       </w:r>
+      <w:r>
+        <w:rPr>
+          <w:rFonts w:ascii="Century Schoolbook" w:hAnsi="Century Schoolbook"/>
+        </w:rPr>
+        <w:t>Theoretical comparison</w:t>
+      </w:r>
+      <w:r>
+        <w:rPr>
+          <w:rFonts w:ascii="Century Schoolbook" w:hAnsi="Century Schoolbook" w:hint="eastAsia"/>
+        </w:rPr>
+        <w:t xml:space="preserve"> </w:t>
+      </w:r>
+      <w:r>
+        <w:rPr>
+          <w:rFonts w:ascii="Century Schoolbook" w:hAnsi="Century Schoolbook"/>
+        </w:rPr>
+        <w:t>and phrasing polish</w:t>
+      </w:r>
     </w:p>
     <w:p>
       <w:pPr>
@@ -4742,61 +5036,34 @@
         </w:rPr>
         <w:t xml:space="preserve"> </w:t>
       </w:r>
-    </w:p>
-    <w:p>
-      <w:pPr>
-        <w:jc w:val="both"/>
-        <w:rPr>
-          <w:rFonts w:ascii="Century Schoolbook" w:hAnsi="Century Schoolbook"/>
-        </w:rPr>
-      </w:pPr>
-    </w:p>
-    <w:p>
-      <w:pPr>
-        <w:jc w:val="both"/>
-        <w:rPr>
-          <w:rFonts w:ascii="Century Schoolbook" w:hAnsi="Century Schoolbook"/>
-        </w:rPr>
-      </w:pPr>
-    </w:p>
-    <w:p>
-      <w:pPr>
-        <w:jc w:val="both"/>
-        <w:rPr>
-          <w:rFonts w:ascii="Century Schoolbook" w:hAnsi="Century Schoolbook"/>
-        </w:rPr>
-      </w:pPr>
-    </w:p>
-    <w:p>
-      <w:pPr>
-        <w:jc w:val="both"/>
-        <w:rPr>
-          <w:rFonts w:ascii="Century Schoolbook" w:hAnsi="Century Schoolbook"/>
-        </w:rPr>
-      </w:pPr>
-    </w:p>
-    <w:p>
-      <w:pPr>
-        <w:jc w:val="both"/>
-        <w:rPr>
-          <w:rFonts w:ascii="Century Schoolbook" w:hAnsi="Century Schoolbook"/>
-        </w:rPr>
-      </w:pPr>
-    </w:p>
-    <w:p>
-      <w:pPr>
-        <w:jc w:val="both"/>
-        <w:rPr>
-          <w:rFonts w:ascii="Century Schoolbook" w:hAnsi="Century Schoolbook"/>
-        </w:rPr>
-      </w:pPr>
-      <w:r>
-        <w:rPr>
-          <w:rFonts w:ascii="Century Schoolbook" w:hAnsi="Century Schoolbook"/>
-        </w:rPr>
-        <w:lastRenderedPageBreak/>
-        <w:pict w14:anchorId="3E56138F">
-          <v:rect id="_x0000_i1036" style="width:0;height:1.5pt" o:hralign="center" o:hrstd="t" o:hr="t" fillcolor="#a0a0a0" stroked="f"/>
+      <w:hyperlink r:id="rId12" w:history="1">
+        <w:r>
+          <w:rPr>
+            <w:rStyle w:val="af2"/>
+            <w:rFonts w:ascii="Century Schoolbook" w:hAnsi="Century Schoolbook"/>
+          </w:rPr>
+          <w:t>https://distill.pub/2016/misread-tsne/</w:t>
+        </w:r>
+      </w:hyperlink>
+    </w:p>
+    <w:p>
+      <w:pPr>
+        <w:jc w:val="both"/>
+        <w:rPr>
+          <w:rFonts w:ascii="Century Schoolbook" w:hAnsi="Century Schoolbook"/>
+        </w:rPr>
+      </w:pPr>
+      <w:r>
+        <w:rPr>
+          <w:noProof/>
+        </w:rPr>
+      </w:r>
+      <w:r>
+        <w:pict w14:anchorId="5D4033C8">
+          <v:rect id="Horizontal Line 12" o:spid="_x0000_s2051" style="width:451.3pt;height:1.1pt;visibility:visible;mso-wrap-style:square;mso-left-percent:-10001;mso-top-percent:-10001;mso-position-horizontal:absolute;mso-position-horizontal-relative:char;mso-position-vertical:absolute;mso-position-vertical-relative:line;mso-left-percent:-10001;mso-top-percent:-10001;v-text-anchor:top" o:gfxdata="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" filled="f">
+            <o:lock v:ext="edit" rotation="t" aspectratio="t" verticies="t" text="t" shapetype="t"/>
+            <w10:anchorlock/>
+          </v:rect>
         </w:pict>
       </w:r>
     </w:p>
@@ -4877,7 +5144,6 @@
         </w:rPr>
         <w:t xml:space="preserve"> (integers 0, 1, 2, 3). Then look at the output of </w:t>
       </w:r>
-      <w:proofErr w:type="spellStart"/>
       <w:r>
         <w:rPr>
           <w:rFonts w:ascii="Century Schoolbook" w:hAnsi="Century Schoolbook"/>
@@ -4886,7 +5152,6 @@
         </w:rPr>
         <w:t>LabelBinarizer</w:t>
       </w:r>
-      <w:proofErr w:type="spellEnd"/>
       <w:r>
         <w:rPr>
           <w:rFonts w:ascii="Century Schoolbook" w:hAnsi="Century Schoolbook"/>
@@ -4912,7 +5177,7 @@
     </w:p>
     <w:p>
       <w:pPr>
-        <w:pStyle w:val="ListParagraph"/>
+        <w:pStyle w:val="a9"/>
         <w:numPr>
           <w:ilvl w:val="0"/>
           <w:numId w:val="23"/>
@@ -4931,7 +5196,7 @@
     </w:p>
     <w:p>
       <w:pPr>
-        <w:pStyle w:val="ListParagraph"/>
+        <w:pStyle w:val="a9"/>
         <w:numPr>
           <w:ilvl w:val="0"/>
           <w:numId w:val="23"/>
@@ -4964,7 +5229,7 @@
     </w:p>
     <w:p>
       <w:pPr>
-        <w:pStyle w:val="ListParagraph"/>
+        <w:pStyle w:val="a9"/>
         <w:numPr>
           <w:ilvl w:val="0"/>
           <w:numId w:val="23"/>
@@ -4983,7 +5248,7 @@
     </w:p>
     <w:p>
       <w:pPr>
-        <w:pStyle w:val="ListParagraph"/>
+        <w:pStyle w:val="a9"/>
         <w:jc w:val="both"/>
         <w:rPr>
           <w:rFonts w:ascii="Century Schoolbook" w:hAnsi="Century Schoolbook"/>
@@ -5005,6 +5270,87 @@
         </w:rPr>
         <w:t>Answer:</w:t>
       </w:r>
+      <w:r>
+        <w:rPr>
+          <w:rFonts w:ascii="Century Schoolbook" w:hAnsi="Century Schoolbook"/>
+          <w:b/>
+          <w:bCs/>
+        </w:rPr>
+        <w:br/>
+      </w:r>
+      <w:r>
+        <w:rPr>
+          <w:rFonts w:ascii="Century Schoolbook" w:hAnsi="Century Schoolbook"/>
+        </w:rPr>
+        <w:t xml:space="preserve">1, </w:t>
+      </w:r>
+      <w:r>
+        <w:rPr>
+          <w:rFonts w:ascii="Century Schoolbook" w:hAnsi="Century Schoolbook" w:hint="eastAsia"/>
+        </w:rPr>
+        <w:t>E</w:t>
+      </w:r>
+      <w:r>
+        <w:rPr>
+          <w:rFonts w:ascii="Century Schoolbook" w:hAnsi="Century Schoolbook"/>
+        </w:rPr>
+        <w:t xml:space="preserve">xactly 4 binary columns are created, where each category is represented by an indicator vector with a 1 in its respective column and 0s elsewhere. </w:t>
+      </w:r>
+    </w:p>
+    <w:p>
+      <w:pPr>
+        <w:jc w:val="both"/>
+        <w:rPr>
+          <w:rFonts w:ascii="Century Schoolbook" w:hAnsi="Century Schoolbook"/>
+        </w:rPr>
+      </w:pPr>
+      <w:r>
+        <w:rPr>
+          <w:rFonts w:ascii="Century Schoolbook" w:hAnsi="Century Schoolbook"/>
+        </w:rPr>
+        <w:t xml:space="preserve">2, </w:t>
+      </w:r>
+      <w:r>
+        <w:rPr>
+          <w:rFonts w:ascii="Century Schoolbook" w:hAnsi="Century Schoolbook"/>
+        </w:rPr>
+        <w:t xml:space="preserve">The algorithm falsely assumes an inherent order and numerical magnitude among the categories assuming </w:t>
+      </w:r>
+      <m:oMath>
+        <m:r>
+          <w:rPr>
+            <w:rFonts w:ascii="Cambria Math" w:hAnsi="Cambria Math"/>
+          </w:rPr>
+          <m:t>3&gt;2&gt;1&gt;0</m:t>
+        </m:r>
+      </m:oMath>
+      <w:r>
+        <w:rPr>
+          <w:rFonts w:ascii="Century Schoolbook" w:hAnsi="Century Schoolbook"/>
+        </w:rPr>
+        <w:t xml:space="preserve"> and that category 2 is twice as far from category 0 as category 1 is, even though the classes are nominal and unordered. </w:t>
+      </w:r>
+    </w:p>
+    <w:p>
+      <w:pPr>
+        <w:jc w:val="both"/>
+        <w:rPr>
+          <w:rFonts w:ascii="Century Schoolbook" w:hAnsi="Century Schoolbook" w:hint="eastAsia"/>
+        </w:rPr>
+      </w:pPr>
+      <w:r>
+        <w:rPr>
+          <w:rFonts w:ascii="Century Schoolbook" w:hAnsi="Century Schoolbook"/>
+        </w:rPr>
+        <w:lastRenderedPageBreak/>
+        <w:t xml:space="preserve">3, </w:t>
+      </w:r>
+      <w:r>
+        <w:rPr>
+          <w:rFonts w:ascii="Century Schoolbook" w:hAnsi="Century Schoolbook"/>
+        </w:rPr>
+        <w:t>One-hot binarization maps each class to an independent, mutually orthogonal dimension. This ensures that the geometric distance between any two distinct categories is identical, completely removing the artificial ordering and unequal distance assumptions.</w:t>
+      </w:r>
     </w:p>
     <w:p>
       <w:pPr>
@@ -5025,7 +5371,7 @@
         <w:rPr>
           <w:rFonts w:ascii="Century Schoolbook" w:hAnsi="Century Schoolbook"/>
         </w:rPr>
-        <w:t xml:space="preserve"> Yes / No </w:t>
+        <w:t xml:space="preserve"> Yes </w:t>
       </w:r>
     </w:p>
     <w:p>
@@ -5049,6 +5395,12 @@
         </w:rPr>
         <w:t xml:space="preserve"> </w:t>
       </w:r>
+      <w:r>
+        <w:rPr>
+          <w:rFonts w:ascii="Century Schoolbook" w:hAnsi="Century Schoolbook"/>
+        </w:rPr>
+        <w:t>Mathematical concept explanation and phrasing polish</w:t>
+      </w:r>
     </w:p>
     <w:p>
       <w:pPr>
@@ -5071,20 +5423,34 @@
         </w:rPr>
         <w:t xml:space="preserve"> </w:t>
       </w:r>
-    </w:p>
-    <w:p>
-      <w:pPr>
-        <w:jc w:val="both"/>
-        <w:rPr>
-          <w:rFonts w:ascii="Century Schoolbook" w:hAnsi="Century Schoolbook"/>
-        </w:rPr>
-      </w:pPr>
-      <w:r>
-        <w:rPr>
-          <w:rFonts w:ascii="Century Schoolbook" w:hAnsi="Century Schoolbook"/>
-        </w:rPr>
-        <w:pict w14:anchorId="07392833">
-          <v:rect id="_x0000_i1037" style="width:0;height:1.5pt" o:hralign="center" o:hrstd="t" o:hr="t" fillcolor="#a0a0a0" stroked="f"/>
+      <w:hyperlink r:id="rId13" w:history="1">
+        <w:r>
+          <w:rPr>
+            <w:rStyle w:val="af2"/>
+            <w:rFonts w:ascii="Century Schoolbook" w:hAnsi="Century Schoolbook"/>
+          </w:rPr>
+          <w:t>https://machinelearningmastery.com/why-one-hot-encode-data-in-machine-learning/</w:t>
+        </w:r>
+      </w:hyperlink>
+    </w:p>
+    <w:p>
+      <w:pPr>
+        <w:jc w:val="both"/>
+        <w:rPr>
+          <w:rFonts w:ascii="Century Schoolbook" w:hAnsi="Century Schoolbook"/>
+        </w:rPr>
+      </w:pPr>
+      <w:r>
+        <w:rPr>
+          <w:noProof/>
+        </w:rPr>
+      </w:r>
+      <w:r>
+        <w:pict w14:anchorId="09511338">
+          <v:rect id="Horizontal Line 13" o:spid="_x0000_s2050" style="width:451.3pt;height:1.1pt;visibility:visible;mso-wrap-style:square;mso-left-percent:-10001;mso-top-percent:-10001;mso-position-horizontal:absolute;mso-position-horizontal-relative:char;mso-position-vertical:absolute;mso-position-vertical-relative:line;mso-left-percent:-10001;mso-top-percent:-10001;v-text-anchor:top" o:gfxdata="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" filled="f">
+            <o:lock v:ext="edit" rotation="t" aspectratio="t" verticies="t" text="t" shapetype="t"/>
+            <w10:anchorlock/>
+          </v:rect>
         </w:pict>
       </w:r>
     </w:p>
@@ -5099,7 +5465,7 @@
 </file>
 
 <file path=word/endnotes.xml><?xml version="1.0" encoding="utf-8"?>
-<w:endnotes xmlns:wpc="http://schemas.microsoft.com/office/word/2010/wordprocessingCanvas" xmlns:cx="http://schemas.microsoft.com/office/drawing/2014/chartex" xmlns:cx1="http://schemas.microsoft.com/office/drawing/2015/9/8/chartex" xmlns:cx2="http://schemas.microsoft.com/office/drawing/2015/10/21/chartex" xmlns:cx3="http://schemas.microsoft.com/office/drawing/2016/5/9/chartex" xmlns:cx4="http://schemas.microsoft.com/office/drawing/2016/5/10/chartex" xmlns:cx5="http://schemas.microsoft.com/office/drawing/2016/5/11/chartex" xmlns:cx6="http://schemas.microsoft.com/office/drawing/2016/5/12/chartex" xmlns:cx7="http://schemas.microsoft.com/office/drawing/2016/5/13/chartex" xmlns:cx8="http://schemas.microsoft.com/office/drawing/2016/5/14/chartex" xmlns:mc="http://schemas.openxmlformats.org/markup-compatibility/2006" xmlns:aink="http://schemas.microsoft.com/office/drawing/2016/ink" xmlns:am3d="http://schemas.microsoft.com/office/drawing/2017/model3d" xmlns:o="urn:schemas-microsoft-com:office:office" xmlns:oel="http://schemas.microsoft.com/office/2019/extlst" xmlns:r="http://schemas.openxmlformats.org/officeDocument/2006/relationships" xmlns:m="http://schemas.openxmlformats.org/officeDocument/2006/math" xmlns:v="urn:schemas-microsoft-com:vml" xmlns:wp14="http://schemas.microsoft.com/office/word/2010/wordprocessingDrawing" xmlns:wp="http://schemas.openxmlformats.org/drawingml/2006/wordprocessingDrawing" xmlns:w10="urn:schemas-microsoft-com:office:word" xmlns:w="http://schemas.openxmlformats.org/wordprocessingml/2006/main" xmlns:w14="http://schemas.microsoft.com/office/word/2010/wordml" xmlns:w15="http://schemas.microsoft.com/office/word/2012/wordml" xmlns:w16cex="http://schemas.microsoft.com/office/word/2018/wordml/cex" xmlns:w16cid="http://schemas.microsoft.com/office/word/2016/wordml/cid" xmlns:w16="http://schemas.microsoft.com/office/word/2018/wordml" xmlns:w16du="http://schemas.microsoft.com/office/word/2023/wordml/word16du" xmlns:w16sdtdh="http://schemas.microsoft.com/office/word/2020/wordml/sdtdatahash" xmlns:w16sdtfl="http://schemas.microsoft.com/office/word/2024/wordml/sdtformatlock" xmlns:w16se="http://schemas.microsoft.com/office/word/2015/wordml/symex" xmlns:wpg="http://schemas.microsoft.com/office/word/2010/wordprocessingGroup" xmlns:wpi="http://schemas.microsoft.com/office/word/2010/wordprocessingInk" xmlns:wne="http://schemas.microsoft.com/office/word/2006/wordml" xmlns:wps="http://schemas.microsoft.com/office/word/2010/wordprocessingShape" mc:Ignorable="w14 w15 w16se w16cid w16 w16cex w16sdtdh w16sdtfl w16du wp14">
+<w:endnotes xmlns:wpc="http://schemas.microsoft.com/office/word/2010/wordprocessingCanvas" xmlns:cx="http://schemas.microsoft.com/office/drawing/2014/chartex" xmlns:cx1="http://schemas.microsoft.com/office/drawing/2015/9/8/chartex" xmlns:cx2="http://schemas.microsoft.com/office/drawing/2015/10/21/chartex" xmlns:cx3="http://schemas.microsoft.com/office/drawing/2016/5/9/chartex" xmlns:cx4="http://schemas.microsoft.com/office/drawing/2016/5/10/chartex" xmlns:cx5="http://schemas.microsoft.com/office/drawing/2016/5/11/chartex" xmlns:cx6="http://schemas.microsoft.com/office/drawing/2016/5/12/chartex" xmlns:cx7="http://schemas.microsoft.com/office/drawing/2016/5/13/chartex" xmlns:cx8="http://schemas.microsoft.com/office/drawing/2016/5/14/chartex" xmlns:mc="http://schemas.openxmlformats.org/markup-compatibility/2006" xmlns:m="http://schemas.openxmlformats.org/officeDocument/2006/math" xmlns:aink="http://schemas.microsoft.com/office/drawing/2016/ink" xmlns:am3d="http://schemas.microsoft.com/office/drawing/2017/model3d" xmlns:oel="http://schemas.microsoft.com/office/2019/extlst" xmlns:r="http://schemas.openxmlformats.org/officeDocument/2006/relationships" xmlns:wp14="http://schemas.microsoft.com/office/word/2010/wordprocessingDrawing" xmlns:wp="http://schemas.openxmlformats.org/drawingml/2006/wordprocessingDrawing" xmlns:wpg="http://schemas.microsoft.com/office/word/2010/wordprocessingGroup" xmlns:wpi="http://schemas.microsoft.com/office/word/2010/wordprocessingInk" xmlns:wps="http://schemas.microsoft.com/office/word/2010/wordprocessingShape" xmlns:o="urn:schemas-microsoft-com:office:office" xmlns:v="urn:schemas-microsoft-com:vml" xmlns:w10="urn:schemas-microsoft-com:office:word" xmlns:w="http://schemas.openxmlformats.org/wordprocessingml/2006/main" xmlns:w14="http://schemas.microsoft.com/office/word/2010/wordml" xmlns:w15="http://schemas.microsoft.com/office/word/2012/wordml" xmlns:w16cex="http://schemas.microsoft.com/office/word/2018/wordml/cex" xmlns:w16cid="http://schemas.microsoft.com/office/word/2016/wordml/cid" xmlns:w16="http://schemas.microsoft.com/office/word/2018/wordml" xmlns:w16sdtdh="http://schemas.microsoft.com/office/word/2020/wordml/sdtdatahash" xmlns:w16sdtfl="http://schemas.microsoft.com/office/word/2024/wordml/sdtformatlock" xmlns:w16se="http://schemas.microsoft.com/office/word/2015/wordml/symex" xmlns:w16du="http://schemas.microsoft.com/office/word/2023/wordml/word16du" xmlns:wne="http://schemas.microsoft.com/office/word/2006/wordml" mc:Ignorable="w14 w15 w16se w16cid w16 w16cex w16sdtdh w16sdtfl w16du wp14">
   <w:endnote w:type="separator" w:id="-1">
     <w:p>
       <w:pPr>
@@ -5124,7 +5490,7 @@
 </file>
 
 <file path=word/footnotes.xml><?xml version="1.0" encoding="utf-8"?>
-<w:footnotes xmlns:wpc="http://schemas.microsoft.com/office/word/2010/wordprocessingCanvas" xmlns:cx="http://schemas.microsoft.com/office/drawing/2014/chartex" xmlns:cx1="http://schemas.microsoft.com/office/drawing/2015/9/8/chartex" xmlns:cx2="http://schemas.microsoft.com/office/drawing/2015/10/21/chartex" xmlns:cx3="http://schemas.microsoft.com/office/drawing/2016/5/9/chartex" xmlns:cx4="http://schemas.microsoft.com/office/drawing/2016/5/10/chartex" xmlns:cx5="http://schemas.microsoft.com/office/drawing/2016/5/11/chartex" xmlns:cx6="http://schemas.microsoft.com/office/drawing/2016/5/12/chartex" xmlns:cx7="http://schemas.microsoft.com/office/drawing/2016/5/13/chartex" xmlns:cx8="http://schemas.microsoft.com/office/drawing/2016/5/14/chartex" xmlns:mc="http://schemas.openxmlformats.org/markup-compatibility/2006" xmlns:aink="http://schemas.microsoft.com/office/drawing/2016/ink" xmlns:am3d="http://schemas.microsoft.com/office/drawing/2017/model3d" xmlns:o="urn:schemas-microsoft-com:office:office" xmlns:oel="http://schemas.microsoft.com/office/2019/extlst" xmlns:r="http://schemas.openxmlformats.org/officeDocument/2006/relationships" xmlns:m="http://schemas.openxmlformats.org/officeDocument/2006/math" xmlns:v="urn:schemas-microsoft-com:vml" xmlns:wp14="http://schemas.microsoft.com/office/word/2010/wordprocessingDrawing" xmlns:wp="http://schemas.openxmlformats.org/drawingml/2006/wordprocessingDrawing" xmlns:w10="urn:schemas-microsoft-com:office:word" xmlns:w="http://schemas.openxmlformats.org/wordprocessingml/2006/main" xmlns:w14="http://schemas.microsoft.com/office/word/2010/wordml" xmlns:w15="http://schemas.microsoft.com/office/word/2012/wordml" xmlns:w16cex="http://schemas.microsoft.com/office/word/2018/wordml/cex" xmlns:w16cid="http://schemas.microsoft.com/office/word/2016/wordml/cid" xmlns:w16="http://schemas.microsoft.com/office/word/2018/wordml" xmlns:w16du="http://schemas.microsoft.com/office/word/2023/wordml/word16du" xmlns:w16sdtdh="http://schemas.microsoft.com/office/word/2020/wordml/sdtdatahash" xmlns:w16sdtfl="http://schemas.microsoft.com/office/word/2024/wordml/sdtformatlock" xmlns:w16se="http://schemas.microsoft.com/office/word/2015/wordml/symex" xmlns:wpg="http://schemas.microsoft.com/office/word/2010/wordprocessingGroup" xmlns:wpi="http://schemas.microsoft.com/office/word/2010/wordprocessingInk" xmlns:wne="http://schemas.microsoft.com/office/word/2006/wordml" xmlns:wps="http://schemas.microsoft.com/office/word/2010/wordprocessingShape" mc:Ignorable="w14 w15 w16se w16cid w16 w16cex w16sdtdh w16sdtfl w16du wp14">
+<w:footnotes xmlns:wpc="http://schemas.microsoft.com/office/word/2010/wordprocessingCanvas" xmlns:cx="http://schemas.microsoft.com/office/drawing/2014/chartex" xmlns:cx1="http://schemas.microsoft.com/office/drawing/2015/9/8/chartex" xmlns:cx2="http://schemas.microsoft.com/office/drawing/2015/10/21/chartex" xmlns:cx3="http://schemas.microsoft.com/office/drawing/2016/5/9/chartex" xmlns:cx4="http://schemas.microsoft.com/office/drawing/2016/5/10/chartex" xmlns:cx5="http://schemas.microsoft.com/office/drawing/2016/5/11/chartex" xmlns:cx6="http://schemas.microsoft.com/office/drawing/2016/5/12/chartex" xmlns:cx7="http://schemas.microsoft.com/office/drawing/2016/5/13/chartex" xmlns:cx8="http://schemas.microsoft.com/office/drawing/2016/5/14/chartex" xmlns:mc="http://schemas.openxmlformats.org/markup-compatibility/2006" xmlns:m="http://schemas.openxmlformats.org/officeDocument/2006/math" xmlns:aink="http://schemas.microsoft.com/office/drawing/2016/ink" xmlns:am3d="http://schemas.microsoft.com/office/drawing/2017/model3d" xmlns:oel="http://schemas.microsoft.com/office/2019/extlst" xmlns:r="http://schemas.openxmlformats.org/officeDocument/2006/relationships" xmlns:wp14="http://schemas.microsoft.com/office/word/2010/wordprocessingDrawing" xmlns:wp="http://schemas.openxmlformats.org/drawingml/2006/wordprocessingDrawing" xmlns:wpg="http://schemas.microsoft.com/office/word/2010/wordprocessingGroup" xmlns:wpi="http://schemas.microsoft.com/office/word/2010/wordprocessingInk" xmlns:wps="http://schemas.microsoft.com/office/word/2010/wordprocessingShape" xmlns:o="urn:schemas-microsoft-com:office:office" xmlns:v="urn:schemas-microsoft-com:vml" xmlns:w10="urn:schemas-microsoft-com:office:word" xmlns:w="http://schemas.openxmlformats.org/wordprocessingml/2006/main" xmlns:w14="http://schemas.microsoft.com/office/word/2010/wordml" xmlns:w15="http://schemas.microsoft.com/office/word/2012/wordml" xmlns:w16cex="http://schemas.microsoft.com/office/word/2018/wordml/cex" xmlns:w16cid="http://schemas.microsoft.com/office/word/2016/wordml/cid" xmlns:w16="http://schemas.microsoft.com/office/word/2018/wordml" xmlns:w16sdtdh="http://schemas.microsoft.com/office/word/2020/wordml/sdtdatahash" xmlns:w16sdtfl="http://schemas.microsoft.com/office/word/2024/wordml/sdtformatlock" xmlns:w16se="http://schemas.microsoft.com/office/word/2015/wordml/symex" xmlns:w16du="http://schemas.microsoft.com/office/word/2023/wordml/word16du" xmlns:wne="http://schemas.microsoft.com/office/word/2006/wordml" mc:Ignorable="w14 w15 w16se w16cid w16 w16cex w16sdtdh w16sdtfl w16du wp14">
   <w:footnote w:type="separator" w:id="-1">
     <w:p>
       <w:pPr>
@@ -5149,7 +5515,7 @@
 </file>
 
 <file path=word/numbering.xml><?xml version="1.0" encoding="utf-8"?>
-<w:numbering xmlns:wpc="http://schemas.microsoft.com/office/word/2010/wordprocessingCanvas" xmlns:cx="http://schemas.microsoft.com/office/drawing/2014/chartex" xmlns:cx1="http://schemas.microsoft.com/office/drawing/2015/9/8/chartex" xmlns:cx2="http://schemas.microsoft.com/office/drawing/2015/10/21/chartex" xmlns:cx3="http://schemas.microsoft.com/office/drawing/2016/5/9/chartex" xmlns:cx4="http://schemas.microsoft.com/office/drawing/2016/5/10/chartex" xmlns:cx5="http://schemas.microsoft.com/office/drawing/2016/5/11/chartex" xmlns:cx6="http://schemas.microsoft.com/office/drawing/2016/5/12/chartex" xmlns:cx7="http://schemas.microsoft.com/office/drawing/2016/5/13/chartex" xmlns:cx8="http://schemas.microsoft.com/office/drawing/2016/5/14/chartex" xmlns:mc="http://schemas.openxmlformats.org/markup-compatibility/2006" xmlns:aink="http://schemas.microsoft.com/office/drawing/2016/ink" xmlns:am3d="http://schemas.microsoft.com/office/drawing/2017/model3d" xmlns:o="urn:schemas-microsoft-com:office:office" xmlns:oel="http://schemas.microsoft.com/office/2019/extlst" xmlns:r="http://schemas.openxmlformats.org/officeDocument/2006/relationships" xmlns:m="http://schemas.openxmlformats.org/officeDocument/2006/math" xmlns:v="urn:schemas-microsoft-com:vml" xmlns:wp14="http://schemas.microsoft.com/office/word/2010/wordprocessingDrawing" xmlns:wp="http://schemas.openxmlformats.org/drawingml/2006/wordprocessingDrawing" xmlns:w10="urn:schemas-microsoft-com:office:word" xmlns:w="http://schemas.openxmlformats.org/wordprocessingml/2006/main" xmlns:w14="http://schemas.microsoft.com/office/word/2010/wordml" xmlns:w15="http://schemas.microsoft.com/office/word/2012/wordml" xmlns:w16cex="http://schemas.microsoft.com/office/word/2018/wordml/cex" xmlns:w16cid="http://schemas.microsoft.com/office/word/2016/wordml/cid" xmlns:w16="http://schemas.microsoft.com/office/word/2018/wordml" xmlns:w16du="http://schemas.microsoft.com/office/word/2023/wordml/word16du" xmlns:w16sdtdh="http://schemas.microsoft.com/office/word/2020/wordml/sdtdatahash" xmlns:w16sdtfl="http://schemas.microsoft.com/office/word/2024/wordml/sdtformatlock" xmlns:w16se="http://schemas.microsoft.com/office/word/2015/wordml/symex" xmlns:wpg="http://schemas.microsoft.com/office/word/2010/wordprocessingGroup" xmlns:wpi="http://schemas.microsoft.com/office/word/2010/wordprocessingInk" xmlns:wne="http://schemas.microsoft.com/office/word/2006/wordml" xmlns:wps="http://schemas.microsoft.com/office/word/2010/wordprocessingShape" mc:Ignorable="w14 w15 w16se w16cid w16 w16cex w16sdtdh w16sdtfl w16du wp14">
+<w:numbering xmlns:wpc="http://schemas.microsoft.com/office/word/2010/wordprocessingCanvas" xmlns:cx="http://schemas.microsoft.com/office/drawing/2014/chartex" xmlns:cx1="http://schemas.microsoft.com/office/drawing/2015/9/8/chartex" xmlns:cx2="http://schemas.microsoft.com/office/drawing/2015/10/21/chartex" xmlns:cx3="http://schemas.microsoft.com/office/drawing/2016/5/9/chartex" xmlns:cx4="http://schemas.microsoft.com/office/drawing/2016/5/10/chartex" xmlns:cx5="http://schemas.microsoft.com/office/drawing/2016/5/11/chartex" xmlns:cx6="http://schemas.microsoft.com/office/drawing/2016/5/12/chartex" xmlns:cx7="http://schemas.microsoft.com/office/drawing/2016/5/13/chartex" xmlns:cx8="http://schemas.microsoft.com/office/drawing/2016/5/14/chartex" xmlns:mc="http://schemas.openxmlformats.org/markup-compatibility/2006" xmlns:m="http://schemas.openxmlformats.org/officeDocument/2006/math" xmlns:aink="http://schemas.microsoft.com/office/drawing/2016/ink" xmlns:am3d="http://schemas.microsoft.com/office/drawing/2017/model3d" xmlns:oel="http://schemas.microsoft.com/office/2019/extlst" xmlns:r="http://schemas.openxmlformats.org/officeDocument/2006/relationships" xmlns:wp14="http://schemas.microsoft.com/office/word/2010/wordprocessingDrawing" xmlns:wp="http://schemas.openxmlformats.org/drawingml/2006/wordprocessingDrawing" xmlns:wpg="http://schemas.microsoft.com/office/word/2010/wordprocessingGroup" xmlns:wpi="http://schemas.microsoft.com/office/word/2010/wordprocessingInk" xmlns:wps="http://schemas.microsoft.com/office/word/2010/wordprocessingShape" xmlns:o="urn:schemas-microsoft-com:office:office" xmlns:v="urn:schemas-microsoft-com:vml" xmlns:w10="urn:schemas-microsoft-com:office:word" xmlns:w="http://schemas.openxmlformats.org/wordprocessingml/2006/main" xmlns:w14="http://schemas.microsoft.com/office/word/2010/wordml" xmlns:w15="http://schemas.microsoft.com/office/word/2012/wordml" xmlns:w16cex="http://schemas.microsoft.com/office/word/2018/wordml/cex" xmlns:w16cid="http://schemas.microsoft.com/office/word/2016/wordml/cid" xmlns:w16="http://schemas.microsoft.com/office/word/2018/wordml" xmlns:w16sdtdh="http://schemas.microsoft.com/office/word/2020/wordml/sdtdatahash" xmlns:w16sdtfl="http://schemas.microsoft.com/office/word/2024/wordml/sdtformatlock" xmlns:w16se="http://schemas.microsoft.com/office/word/2015/wordml/symex" xmlns:w16du="http://schemas.microsoft.com/office/word/2023/wordml/word16du" xmlns:wne="http://schemas.microsoft.com/office/word/2006/wordml" mc:Ignorable="w14 w15 w16se w16cid w16 w16cex w16sdtdh w16sdtfl w16du wp14">
   <w:abstractNum w:abstractNumId="0" w15:restartNumberingAfterBreak="0">
     <w:nsid w:val="02604484"/>
     <w:multiLevelType w:val="multilevel"/>
@@ -8160,7 +8526,7 @@
 </file>
 
 <file path=word/styles.xml><?xml version="1.0" encoding="utf-8"?>
-<w:styles xmlns:mc="http://schemas.openxmlformats.org/markup-compatibility/2006" xmlns:r="http://schemas.openxmlformats.org/officeDocument/2006/relationships" xmlns:w="http://schemas.openxmlformats.org/wordprocessingml/2006/main" xmlns:w14="http://schemas.microsoft.com/office/word/2010/wordml" xmlns:w15="http://schemas.microsoft.com/office/word/2012/wordml" xmlns:w16cex="http://schemas.microsoft.com/office/word/2018/wordml/cex" xmlns:w16cid="http://schemas.microsoft.com/office/word/2016/wordml/cid" xmlns:w16="http://schemas.microsoft.com/office/word/2018/wordml" xmlns:w16du="http://schemas.microsoft.com/office/word/2023/wordml/word16du" xmlns:w16sdtdh="http://schemas.microsoft.com/office/word/2020/wordml/sdtdatahash" xmlns:w16sdtfl="http://schemas.microsoft.com/office/word/2024/wordml/sdtformatlock" xmlns:w16se="http://schemas.microsoft.com/office/word/2015/wordml/symex" mc:Ignorable="w14 w15 w16se w16cid w16 w16cex w16sdtdh w16sdtfl w16du">
+<w:styles xmlns:mc="http://schemas.openxmlformats.org/markup-compatibility/2006" xmlns:r="http://schemas.openxmlformats.org/officeDocument/2006/relationships" xmlns:w="http://schemas.openxmlformats.org/wordprocessingml/2006/main" xmlns:w14="http://schemas.microsoft.com/office/word/2010/wordml" xmlns:w15="http://schemas.microsoft.com/office/word/2012/wordml" xmlns:w16cex="http://schemas.microsoft.com/office/word/2018/wordml/cex" xmlns:w16cid="http://schemas.microsoft.com/office/word/2016/wordml/cid" xmlns:w16="http://schemas.microsoft.com/office/word/2018/wordml" xmlns:w16sdtdh="http://schemas.microsoft.com/office/word/2020/wordml/sdtdatahash" xmlns:w16sdtfl="http://schemas.microsoft.com/office/word/2024/wordml/sdtformatlock" xmlns:w16se="http://schemas.microsoft.com/office/word/2015/wordml/symex" xmlns:w16du="http://schemas.microsoft.com/office/word/2023/wordml/word16du" mc:Ignorable="w14 w15 w16se w16cid w16 w16cex w16sdtdh w16sdtfl w16du">
   <w:docDefaults>
     <w:rPrDefault>
       <w:rPr>
@@ -8556,15 +8922,15 @@
     <w:lsdException w:name="Unresolved Mention" w:semiHidden="1" w:unhideWhenUsed="1"/>
     <w:lsdException w:name="Smart Link" w:semiHidden="1" w:unhideWhenUsed="1"/>
   </w:latentStyles>
-  <w:style w:type="paragraph" w:default="1" w:styleId="Normal">
+  <w:style w:type="paragraph" w:default="1" w:styleId="a">
     <w:name w:val="Normal"/>
     <w:qFormat/>
   </w:style>
-  <w:style w:type="paragraph" w:styleId="Heading1">
+  <w:style w:type="paragraph" w:styleId="1">
     <w:name w:val="heading 1"/>
-    <w:basedOn w:val="Normal"/>
-    <w:next w:val="Normal"/>
-    <w:link w:val="Heading1Char"/>
+    <w:basedOn w:val="a"/>
+    <w:next w:val="a"/>
+    <w:link w:val="10"/>
     <w:uiPriority w:val="9"/>
     <w:qFormat/>
     <w:rsid w:val="0018685D"/>
@@ -8581,11 +8947,11 @@
       <w:szCs w:val="40"/>
     </w:rPr>
   </w:style>
-  <w:style w:type="paragraph" w:styleId="Heading2">
+  <w:style w:type="paragraph" w:styleId="2">
     <w:name w:val="heading 2"/>
-    <w:basedOn w:val="Normal"/>
-    <w:next w:val="Normal"/>
-    <w:link w:val="Heading2Char"/>
+    <w:basedOn w:val="a"/>
+    <w:next w:val="a"/>
+    <w:link w:val="20"/>
     <w:uiPriority w:val="9"/>
     <w:semiHidden/>
     <w:unhideWhenUsed/>
@@ -8604,11 +8970,11 @@
       <w:szCs w:val="32"/>
     </w:rPr>
   </w:style>
-  <w:style w:type="paragraph" w:styleId="Heading3">
+  <w:style w:type="paragraph" w:styleId="3">
     <w:name w:val="heading 3"/>
-    <w:basedOn w:val="Normal"/>
-    <w:next w:val="Normal"/>
-    <w:link w:val="Heading3Char"/>
+    <w:basedOn w:val="a"/>
+    <w:next w:val="a"/>
+    <w:link w:val="30"/>
     <w:uiPriority w:val="9"/>
     <w:semiHidden/>
     <w:unhideWhenUsed/>
@@ -8627,11 +8993,11 @@
       <w:szCs w:val="28"/>
     </w:rPr>
   </w:style>
-  <w:style w:type="paragraph" w:styleId="Heading4">
+  <w:style w:type="paragraph" w:styleId="4">
     <w:name w:val="heading 4"/>
-    <w:basedOn w:val="Normal"/>
-    <w:next w:val="Normal"/>
-    <w:link w:val="Heading4Char"/>
+    <w:basedOn w:val="a"/>
+    <w:next w:val="a"/>
+    <w:link w:val="40"/>
     <w:uiPriority w:val="9"/>
     <w:semiHidden/>
     <w:unhideWhenUsed/>
@@ -8650,11 +9016,11 @@
       <w:color w:val="0F4761" w:themeColor="accent1" w:themeShade="BF"/>
     </w:rPr>
   </w:style>
-  <w:style w:type="paragraph" w:styleId="Heading5">
+  <w:style w:type="paragraph" w:styleId="5">
     <w:name w:val="heading 5"/>
-    <w:basedOn w:val="Normal"/>
-    <w:next w:val="Normal"/>
-    <w:link w:val="Heading5Char"/>
+    <w:basedOn w:val="a"/>
+    <w:next w:val="a"/>
+    <w:link w:val="50"/>
     <w:uiPriority w:val="9"/>
     <w:semiHidden/>
     <w:unhideWhenUsed/>
@@ -8671,11 +9037,11 @@
       <w:color w:val="0F4761" w:themeColor="accent1" w:themeShade="BF"/>
     </w:rPr>
   </w:style>
-  <w:style w:type="paragraph" w:styleId="Heading6">
+  <w:style w:type="paragraph" w:styleId="6">
     <w:name w:val="heading 6"/>
-    <w:basedOn w:val="Normal"/>
-    <w:next w:val="Normal"/>
-    <w:link w:val="Heading6Char"/>
+    <w:basedOn w:val="a"/>
+    <w:next w:val="a"/>
+    <w:link w:val="60"/>
     <w:uiPriority w:val="9"/>
     <w:semiHidden/>
     <w:unhideWhenUsed/>
@@ -8694,11 +9060,11 @@
       <w:color w:val="595959" w:themeColor="text1" w:themeTint="A6"/>
     </w:rPr>
   </w:style>
-  <w:style w:type="paragraph" w:styleId="Heading7">
+  <w:style w:type="paragraph" w:styleId="7">
     <w:name w:val="heading 7"/>
-    <w:basedOn w:val="Normal"/>
-    <w:next w:val="Normal"/>
-    <w:link w:val="Heading7Char"/>
+    <w:basedOn w:val="a"/>
+    <w:next w:val="a"/>
+    <w:link w:val="70"/>
     <w:uiPriority w:val="9"/>
     <w:semiHidden/>
     <w:unhideWhenUsed/>
@@ -8715,11 +9081,11 @@
       <w:color w:val="595959" w:themeColor="text1" w:themeTint="A6"/>
     </w:rPr>
   </w:style>
-  <w:style w:type="paragraph" w:styleId="Heading8">
+  <w:style w:type="paragraph" w:styleId="8">
     <w:name w:val="heading 8"/>
-    <w:basedOn w:val="Normal"/>
-    <w:next w:val="Normal"/>
-    <w:link w:val="Heading8Char"/>
+    <w:basedOn w:val="a"/>
+    <w:next w:val="a"/>
+    <w:link w:val="80"/>
     <w:uiPriority w:val="9"/>
     <w:semiHidden/>
     <w:unhideWhenUsed/>
@@ -8738,11 +9104,11 @@
       <w:color w:val="272727" w:themeColor="text1" w:themeTint="D8"/>
     </w:rPr>
   </w:style>
-  <w:style w:type="paragraph" w:styleId="Heading9">
+  <w:style w:type="paragraph" w:styleId="9">
     <w:name w:val="heading 9"/>
-    <w:basedOn w:val="Normal"/>
-    <w:next w:val="Normal"/>
-    <w:link w:val="Heading9Char"/>
+    <w:basedOn w:val="a"/>
+    <w:next w:val="a"/>
+    <w:link w:val="90"/>
     <w:uiPriority w:val="9"/>
     <w:semiHidden/>
     <w:unhideWhenUsed/>
@@ -8759,12 +9125,12 @@
       <w:color w:val="272727" w:themeColor="text1" w:themeTint="D8"/>
     </w:rPr>
   </w:style>
-  <w:style w:type="character" w:default="1" w:styleId="DefaultParagraphFont">
+  <w:style w:type="character" w:default="1" w:styleId="a0">
     <w:name w:val="Default Paragraph Font"/>
     <w:uiPriority w:val="1"/>
     <w:unhideWhenUsed/>
   </w:style>
-  <w:style w:type="table" w:default="1" w:styleId="TableNormal">
+  <w:style w:type="table" w:default="1" w:styleId="a1">
     <w:name w:val="Normal Table"/>
     <w:uiPriority w:val="99"/>
     <w:semiHidden/>
@@ -8779,16 +9145,16 @@
       </w:tblCellMar>
     </w:tblPr>
   </w:style>
-  <w:style w:type="numbering" w:default="1" w:styleId="NoList">
+  <w:style w:type="numbering" w:default="1" w:styleId="a2">
     <w:name w:val="No List"/>
     <w:uiPriority w:val="99"/>
     <w:semiHidden/>
     <w:unhideWhenUsed/>
   </w:style>
-  <w:style w:type="character" w:customStyle="1" w:styleId="Heading1Char">
-    <w:name w:val="Heading 1 Char"/>
-    <w:basedOn w:val="DefaultParagraphFont"/>
-    <w:link w:val="Heading1"/>
+  <w:style w:type="character" w:customStyle="1" w:styleId="10">
+    <w:name w:val="標題 1 字元"/>
+    <w:basedOn w:val="a0"/>
+    <w:link w:val="1"/>
     <w:uiPriority w:val="9"/>
     <w:rsid w:val="0018685D"/>
     <w:rPr>
@@ -8798,10 +9164,10 @@
       <w:szCs w:val="40"/>
     </w:rPr>
   </w:style>
-  <w:style w:type="character" w:customStyle="1" w:styleId="Heading2Char">
-    <w:name w:val="Heading 2 Char"/>
-    <w:basedOn w:val="DefaultParagraphFont"/>
-    <w:link w:val="Heading2"/>
+  <w:style w:type="character" w:customStyle="1" w:styleId="20">
+    <w:name w:val="標題 2 字元"/>
+    <w:basedOn w:val="a0"/>
+    <w:link w:val="2"/>
     <w:uiPriority w:val="9"/>
     <w:semiHidden/>
     <w:rsid w:val="0018685D"/>
@@ -8812,10 +9178,10 @@
       <w:szCs w:val="32"/>
     </w:rPr>
   </w:style>
-  <w:style w:type="character" w:customStyle="1" w:styleId="Heading3Char">
-    <w:name w:val="Heading 3 Char"/>
-    <w:basedOn w:val="DefaultParagraphFont"/>
-    <w:link w:val="Heading3"/>
+  <w:style w:type="character" w:customStyle="1" w:styleId="30">
+    <w:name w:val="標題 3 字元"/>
+    <w:basedOn w:val="a0"/>
+    <w:link w:val="3"/>
     <w:uiPriority w:val="9"/>
     <w:semiHidden/>
     <w:rsid w:val="0018685D"/>
@@ -8826,10 +9192,10 @@
       <w:szCs w:val="28"/>
     </w:rPr>
   </w:style>
-  <w:style w:type="character" w:customStyle="1" w:styleId="Heading4Char">
-    <w:name w:val="Heading 4 Char"/>
-    <w:basedOn w:val="DefaultParagraphFont"/>
-    <w:link w:val="Heading4"/>
+  <w:style w:type="character" w:customStyle="1" w:styleId="40">
+    <w:name w:val="標題 4 字元"/>
+    <w:basedOn w:val="a0"/>
+    <w:link w:val="4"/>
     <w:uiPriority w:val="9"/>
     <w:semiHidden/>
     <w:rsid w:val="0018685D"/>
@@ -8840,10 +9206,10 @@
       <w:color w:val="0F4761" w:themeColor="accent1" w:themeShade="BF"/>
     </w:rPr>
   </w:style>
-  <w:style w:type="character" w:customStyle="1" w:styleId="Heading5Char">
-    <w:name w:val="Heading 5 Char"/>
-    <w:basedOn w:val="DefaultParagraphFont"/>
-    <w:link w:val="Heading5"/>
+  <w:style w:type="character" w:customStyle="1" w:styleId="50">
+    <w:name w:val="標題 5 字元"/>
+    <w:basedOn w:val="a0"/>
+    <w:link w:val="5"/>
     <w:uiPriority w:val="9"/>
     <w:semiHidden/>
     <w:rsid w:val="0018685D"/>
@@ -8852,10 +9218,10 @@
       <w:color w:val="0F4761" w:themeColor="accent1" w:themeShade="BF"/>
     </w:rPr>
   </w:style>
-  <w:style w:type="character" w:customStyle="1" w:styleId="Heading6Char">
-    <w:name w:val="Heading 6 Char"/>
-    <w:basedOn w:val="DefaultParagraphFont"/>
-    <w:link w:val="Heading6"/>
+  <w:style w:type="character" w:customStyle="1" w:styleId="60">
+    <w:name w:val="標題 6 字元"/>
+    <w:basedOn w:val="a0"/>
+    <w:link w:val="6"/>
     <w:uiPriority w:val="9"/>
     <w:semiHidden/>
     <w:rsid w:val="0018685D"/>
@@ -8866,10 +9232,10 @@
       <w:color w:val="595959" w:themeColor="text1" w:themeTint="A6"/>
     </w:rPr>
   </w:style>
-  <w:style w:type="character" w:customStyle="1" w:styleId="Heading7Char">
-    <w:name w:val="Heading 7 Char"/>
-    <w:basedOn w:val="DefaultParagraphFont"/>
-    <w:link w:val="Heading7"/>
+  <w:style w:type="character" w:customStyle="1" w:styleId="70">
+    <w:name w:val="標題 7 字元"/>
+    <w:basedOn w:val="a0"/>
+    <w:link w:val="7"/>
     <w:uiPriority w:val="9"/>
     <w:semiHidden/>
     <w:rsid w:val="0018685D"/>
@@ -8878,10 +9244,10 @@
       <w:color w:val="595959" w:themeColor="text1" w:themeTint="A6"/>
     </w:rPr>
   </w:style>
-  <w:style w:type="character" w:customStyle="1" w:styleId="Heading8Char">
-    <w:name w:val="Heading 8 Char"/>
-    <w:basedOn w:val="DefaultParagraphFont"/>
-    <w:link w:val="Heading8"/>
+  <w:style w:type="character" w:customStyle="1" w:styleId="80">
+    <w:name w:val="標題 8 字元"/>
+    <w:basedOn w:val="a0"/>
+    <w:link w:val="8"/>
     <w:uiPriority w:val="9"/>
     <w:semiHidden/>
     <w:rsid w:val="0018685D"/>
@@ -8892,10 +9258,10 @@
       <w:color w:val="272727" w:themeColor="text1" w:themeTint="D8"/>
     </w:rPr>
   </w:style>
-  <w:style w:type="character" w:customStyle="1" w:styleId="Heading9Char">
-    <w:name w:val="Heading 9 Char"/>
-    <w:basedOn w:val="DefaultParagraphFont"/>
-    <w:link w:val="Heading9"/>
+  <w:style w:type="character" w:customStyle="1" w:styleId="90">
+    <w:name w:val="標題 9 字元"/>
+    <w:basedOn w:val="a0"/>
+    <w:link w:val="9"/>
     <w:uiPriority w:val="9"/>
     <w:semiHidden/>
     <w:rsid w:val="0018685D"/>
@@ -8904,11 +9270,11 @@
       <w:color w:val="272727" w:themeColor="text1" w:themeTint="D8"/>
     </w:rPr>
   </w:style>
-  <w:style w:type="paragraph" w:styleId="Title">
+  <w:style w:type="paragraph" w:styleId="a3">
     <w:name w:val="Title"/>
-    <w:basedOn w:val="Normal"/>
-    <w:next w:val="Normal"/>
-    <w:link w:val="TitleChar"/>
+    <w:basedOn w:val="a"/>
+    <w:next w:val="a"/>
+    <w:link w:val="a4"/>
     <w:uiPriority w:val="10"/>
     <w:qFormat/>
     <w:rsid w:val="0018685D"/>
@@ -8924,10 +9290,10 @@
       <w:szCs w:val="56"/>
     </w:rPr>
   </w:style>
-  <w:style w:type="character" w:customStyle="1" w:styleId="TitleChar">
-    <w:name w:val="Title Char"/>
-    <w:basedOn w:val="DefaultParagraphFont"/>
-    <w:link w:val="Title"/>
+  <w:style w:type="character" w:customStyle="1" w:styleId="a4">
+    <w:name w:val="標題 字元"/>
+    <w:basedOn w:val="a0"/>
+    <w:link w:val="a3"/>
     <w:uiPriority w:val="10"/>
     <w:rsid w:val="0018685D"/>
     <w:rPr>
@@ -8938,11 +9304,11 @@
       <w:szCs w:val="56"/>
     </w:rPr>
   </w:style>
-  <w:style w:type="paragraph" w:styleId="Subtitle">
+  <w:style w:type="paragraph" w:styleId="a5">
     <w:name w:val="Subtitle"/>
-    <w:basedOn w:val="Normal"/>
-    <w:next w:val="Normal"/>
-    <w:link w:val="SubtitleChar"/>
+    <w:basedOn w:val="a"/>
+    <w:next w:val="a"/>
+    <w:link w:val="a6"/>
     <w:uiPriority w:val="11"/>
     <w:qFormat/>
     <w:rsid w:val="0018685D"/>
@@ -8959,10 +9325,10 @@
       <w:szCs w:val="28"/>
     </w:rPr>
   </w:style>
-  <w:style w:type="character" w:customStyle="1" w:styleId="SubtitleChar">
-    <w:name w:val="Subtitle Char"/>
-    <w:basedOn w:val="DefaultParagraphFont"/>
-    <w:link w:val="Subtitle"/>
+  <w:style w:type="character" w:customStyle="1" w:styleId="a6">
+    <w:name w:val="副標題 字元"/>
+    <w:basedOn w:val="a0"/>
+    <w:link w:val="a5"/>
     <w:uiPriority w:val="11"/>
     <w:rsid w:val="0018685D"/>
     <w:rPr>
@@ -8973,11 +9339,11 @@
       <w:szCs w:val="28"/>
     </w:rPr>
   </w:style>
-  <w:style w:type="paragraph" w:styleId="Quote">
+  <w:style w:type="paragraph" w:styleId="a7">
     <w:name w:val="Quote"/>
-    <w:basedOn w:val="Normal"/>
-    <w:next w:val="Normal"/>
-    <w:link w:val="QuoteChar"/>
+    <w:basedOn w:val="a"/>
+    <w:next w:val="a"/>
+    <w:link w:val="a8"/>
     <w:uiPriority w:val="29"/>
     <w:qFormat/>
     <w:rsid w:val="0018685D"/>
@@ -8991,10 +9357,10 @@
       <w:color w:val="404040" w:themeColor="text1" w:themeTint="BF"/>
     </w:rPr>
   </w:style>
-  <w:style w:type="character" w:customStyle="1" w:styleId="QuoteChar">
-    <w:name w:val="Quote Char"/>
-    <w:basedOn w:val="DefaultParagraphFont"/>
-    <w:link w:val="Quote"/>
+  <w:style w:type="character" w:customStyle="1" w:styleId="a8">
+    <w:name w:val="引文 字元"/>
+    <w:basedOn w:val="a0"/>
+    <w:link w:val="a7"/>
     <w:uiPriority w:val="29"/>
     <w:rsid w:val="0018685D"/>
     <w:rPr>
@@ -9003,9 +9369,9 @@
       <w:color w:val="404040" w:themeColor="text1" w:themeTint="BF"/>
     </w:rPr>
   </w:style>
-  <w:style w:type="paragraph" w:styleId="ListParagraph">
+  <w:style w:type="paragraph" w:styleId="a9">
     <w:name w:val="List Paragraph"/>
-    <w:basedOn w:val="Normal"/>
+    <w:basedOn w:val="a"/>
     <w:uiPriority w:val="34"/>
     <w:qFormat/>
     <w:rsid w:val="0018685D"/>
@@ -9014,9 +9380,9 @@
       <w:contextualSpacing/>
     </w:pPr>
   </w:style>
-  <w:style w:type="character" w:styleId="IntenseEmphasis">
+  <w:style w:type="character" w:styleId="aa">
     <w:name w:val="Intense Emphasis"/>
-    <w:basedOn w:val="DefaultParagraphFont"/>
+    <w:basedOn w:val="a0"/>
     <w:uiPriority w:val="21"/>
     <w:qFormat/>
     <w:rsid w:val="0018685D"/>
@@ -9026,11 +9392,11 @@
       <w:color w:val="0F4761" w:themeColor="accent1" w:themeShade="BF"/>
     </w:rPr>
   </w:style>
-  <w:style w:type="paragraph" w:styleId="IntenseQuote">
+  <w:style w:type="paragraph" w:styleId="ab">
     <w:name w:val="Intense Quote"/>
-    <w:basedOn w:val="Normal"/>
-    <w:next w:val="Normal"/>
-    <w:link w:val="IntenseQuoteChar"/>
+    <w:basedOn w:val="a"/>
+    <w:next w:val="a"/>
+    <w:link w:val="ac"/>
     <w:uiPriority w:val="30"/>
     <w:qFormat/>
     <w:rsid w:val="0018685D"/>
@@ -9049,10 +9415,10 @@
       <w:color w:val="0F4761" w:themeColor="accent1" w:themeShade="BF"/>
     </w:rPr>
   </w:style>
-  <w:style w:type="character" w:customStyle="1" w:styleId="IntenseQuoteChar">
-    <w:name w:val="Intense Quote Char"/>
-    <w:basedOn w:val="DefaultParagraphFont"/>
-    <w:link w:val="IntenseQuote"/>
+  <w:style w:type="character" w:customStyle="1" w:styleId="ac">
+    <w:name w:val="鮮明引文 字元"/>
+    <w:basedOn w:val="a0"/>
+    <w:link w:val="ab"/>
     <w:uiPriority w:val="30"/>
     <w:rsid w:val="0018685D"/>
     <w:rPr>
@@ -9061,9 +9427,9 @@
       <w:color w:val="0F4761" w:themeColor="accent1" w:themeShade="BF"/>
     </w:rPr>
   </w:style>
-  <w:style w:type="character" w:styleId="IntenseReference">
+  <w:style w:type="character" w:styleId="ad">
     <w:name w:val="Intense Reference"/>
-    <w:basedOn w:val="DefaultParagraphFont"/>
+    <w:basedOn w:val="a0"/>
     <w:uiPriority w:val="32"/>
     <w:qFormat/>
     <w:rsid w:val="0018685D"/>
@@ -9075,9 +9441,9 @@
       <w:spacing w:val="5"/>
     </w:rPr>
   </w:style>
-  <w:style w:type="paragraph" w:styleId="NormalWeb">
+  <w:style w:type="paragraph" w:styleId="Web">
     <w:name w:val="Normal (Web)"/>
-    <w:basedOn w:val="Normal"/>
+    <w:basedOn w:val="a"/>
     <w:uiPriority w:val="99"/>
     <w:semiHidden/>
     <w:unhideWhenUsed/>
@@ -9094,10 +9460,10 @@
       <w14:ligatures w14:val="none"/>
     </w:rPr>
   </w:style>
-  <w:style w:type="paragraph" w:styleId="Header">
+  <w:style w:type="paragraph" w:styleId="ae">
     <w:name w:val="header"/>
-    <w:basedOn w:val="Normal"/>
-    <w:link w:val="HeaderChar"/>
+    <w:basedOn w:val="a"/>
+    <w:link w:val="af"/>
     <w:uiPriority w:val="99"/>
     <w:unhideWhenUsed/>
     <w:rsid w:val="00B11B3A"/>
@@ -9109,17 +9475,17 @@
       <w:spacing w:after="0" w:line="240" w:lineRule="auto"/>
     </w:pPr>
   </w:style>
-  <w:style w:type="character" w:customStyle="1" w:styleId="HeaderChar">
-    <w:name w:val="Header Char"/>
-    <w:basedOn w:val="DefaultParagraphFont"/>
-    <w:link w:val="Header"/>
+  <w:style w:type="character" w:customStyle="1" w:styleId="af">
+    <w:name w:val="頁首 字元"/>
+    <w:basedOn w:val="a0"/>
+    <w:link w:val="ae"/>
     <w:uiPriority w:val="99"/>
     <w:rsid w:val="00B11B3A"/>
   </w:style>
-  <w:style w:type="paragraph" w:styleId="Footer">
+  <w:style w:type="paragraph" w:styleId="af0">
     <w:name w:val="footer"/>
-    <w:basedOn w:val="Normal"/>
-    <w:link w:val="FooterChar"/>
+    <w:basedOn w:val="a"/>
+    <w:link w:val="af1"/>
     <w:uiPriority w:val="99"/>
     <w:unhideWhenUsed/>
     <w:rsid w:val="00B11B3A"/>
@@ -9131,12 +9497,47 @@
       <w:spacing w:after="0" w:line="240" w:lineRule="auto"/>
     </w:pPr>
   </w:style>
-  <w:style w:type="character" w:customStyle="1" w:styleId="FooterChar">
-    <w:name w:val="Footer Char"/>
-    <w:basedOn w:val="DefaultParagraphFont"/>
-    <w:link w:val="Footer"/>
+  <w:style w:type="character" w:customStyle="1" w:styleId="af1">
+    <w:name w:val="頁尾 字元"/>
+    <w:basedOn w:val="a0"/>
+    <w:link w:val="af0"/>
     <w:uiPriority w:val="99"/>
     <w:rsid w:val="00B11B3A"/>
+  </w:style>
+  <w:style w:type="character" w:styleId="af2">
+    <w:name w:val="Hyperlink"/>
+    <w:basedOn w:val="a0"/>
+    <w:uiPriority w:val="99"/>
+    <w:unhideWhenUsed/>
+    <w:rsid w:val="00B776B4"/>
+    <w:rPr>
+      <w:color w:val="467886" w:themeColor="hyperlink"/>
+      <w:u w:val="single"/>
+    </w:rPr>
+  </w:style>
+  <w:style w:type="character" w:styleId="af3">
+    <w:name w:val="Unresolved Mention"/>
+    <w:basedOn w:val="a0"/>
+    <w:uiPriority w:val="99"/>
+    <w:semiHidden/>
+    <w:unhideWhenUsed/>
+    <w:rsid w:val="00B776B4"/>
+    <w:rPr>
+      <w:color w:val="605E5C"/>
+      <w:shd w:val="clear" w:color="auto" w:fill="E1DFDD"/>
+    </w:rPr>
+  </w:style>
+  <w:style w:type="character" w:styleId="af4">
+    <w:name w:val="FollowedHyperlink"/>
+    <w:basedOn w:val="a0"/>
+    <w:uiPriority w:val="99"/>
+    <w:semiHidden/>
+    <w:unhideWhenUsed/>
+    <w:rsid w:val="00EB04E7"/>
+    <w:rPr>
+      <w:color w:val="96607D" w:themeColor="followedHyperlink"/>
+      <w:u w:val="single"/>
+    </w:rPr>
   </w:style>
 </w:styles>
 </file>

</xml_diff>